<commit_message>
Lay out the teacher's speaking parts as a script
The run sheet said what happens each minute but left the teacher to improvise
the words, which is the one thing this room cannot rely on. File 0 now opens
with sixteen numbered parts, each carrying its cue and its lines in full.

Spoken text is set large; stage directions are small, grey, italic and
bracketed in the source so the renderer can tell them apart and the eye can
skip them. The three send-offs — turning them loose on the incident report,
on the interview prep sheet, and on the supplemental report — are accented
separately, since those are the transitions that decide whether the block
works.

Also adds the two off-script moments that happen in nearly every room: a
student naming the former employee as the suspect, and a student annoyed that
the camera was broken. Both have the words ready.

Co-Authored-By: Claude Opus 5 <noreply@anthropic.com>
Claude-Session: https://claude.ai/code/session_01CossLQK1peda73Yt2RrPyH
</commit_message>
<xml_diff>
--- a/lessons/02 - report writing/0 - TEACHER - Run Sheet - Day 1 and Day 2.docx
+++ b/lessons/02 - report writing/0 - TEACHER - Run Sheet - Day 1 and Day 2.docx
@@ -706,6 +706,4083 @@
         </w:tc>
       </w:tr>
     </w:tbl>
+    <w:p>
+      <w:r>
+        <w:br w:type="page"/>
+      </w:r>
+    </w:p>
+    <w:p>
+      <w:pPr>
+        <w:spacing w:after="60"/>
+      </w:pPr>
+      <w:r>
+        <w:rPr>
+          <w:b/>
+          <w:bCs/>
+          <w:color w:val="10243A"/>
+          <w:sz w:val="38"/>
+          <w:szCs w:val="38"/>
+        </w:rPr>
+        <w:t xml:space="preserve">Your Parts</w:t>
+      </w:r>
+    </w:p>
+    <w:p>
+      <w:pPr>
+        <w:spacing w:after="120" w:line="290"/>
+      </w:pPr>
+      <w:r>
+        <w:rPr>
+          <w:color w:val="5F6B79"/>
+          <w:sz w:val="21"/>
+          <w:szCs w:val="21"/>
+        </w:rPr>
+        <w:t xml:space="preserve">Everything you say, in order. Each part is numbered, has its cue, and gives you the words. Bracketed lines are directions, not lines — do not read them out. Nothing here needs memorising; it needs saying.</w:t>
+      </w:r>
+    </w:p>
+    <w:tbl>
+      <w:tblPr>
+        <w:tblW w:type="dxa" w:w="9360"/>
+        <w:tblBorders>
+          <w:top w:val="single" w:color="1A5FB4" w:sz="8"/>
+          <w:left w:val="single" w:color="1A5FB4" w:sz="8"/>
+          <w:bottom w:val="single" w:color="1A5FB4" w:sz="8"/>
+          <w:right w:val="single" w:color="1A5FB4" w:sz="8"/>
+          <w:insideH w:val="single" w:color="1A5FB4" w:sz="8"/>
+          <w:insideV w:val="single" w:color="1A5FB4" w:sz="8"/>
+        </w:tblBorders>
+      </w:tblPr>
+      <w:tblGrid>
+        <w:gridCol w:w="9360"/>
+      </w:tblGrid>
+      <w:tr>
+        <w:tc>
+          <w:tcPr>
+            <w:tcW w:type="dxa" w:w="9360"/>
+            <w:tcMar>
+              <w:top w:type="dxa" w:w="160"/>
+              <w:left w:type="dxa" w:w="200"/>
+              <w:bottom w:type="dxa" w:w="160"/>
+              <w:right w:type="dxa" w:w="200"/>
+            </w:tcMar>
+          </w:tcPr>
+          <w:p>
+            <w:pPr>
+              <w:spacing w:after="70"/>
+            </w:pPr>
+            <w:r>
+              <w:rPr>
+                <w:b/>
+                <w:bCs/>
+                <w:color w:val="1A5FB4"/>
+                <w:sz w:val="17"/>
+                <w:szCs w:val="17"/>
+                <w:spacing w:val="20"/>
+              </w:rPr>
+              <w:t xml:space="preserve">HOW TO READ THIS PAGE</w:t>
+            </w:r>
+          </w:p>
+          <w:p>
+            <w:pPr>
+              <w:spacing w:after="70" w:line="285"/>
+            </w:pPr>
+            <w:r>
+              <w:rPr>
+                <w:color w:val="1B1B1B"/>
+                <w:sz w:val="20"/>
+                <w:szCs w:val="20"/>
+              </w:rPr>
+              <w:t xml:space="preserve">Large black text is yours to say out loud. Small grey italic text in brackets is a direction — do not read it out.</w:t>
+            </w:r>
+          </w:p>
+          <w:p>
+            <w:pPr>
+              <w:spacing w:after="0" w:line="285"/>
+            </w:pPr>
+            <w:r>
+              <w:rPr>
+                <w:color w:val="1B1B1B"/>
+                <w:sz w:val="20"/>
+                <w:szCs w:val="20"/>
+              </w:rPr>
+              <w:t xml:space="preserve">The three orange parts are the send-offs: the moment you turn them loose on an assignment. Those are the ones to get right.</w:t>
+            </w:r>
+          </w:p>
+        </w:tc>
+      </w:tr>
+    </w:tbl>
+    <w:p>
+      <w:pPr>
+        <w:spacing w:after="230" w:line="276"/>
+      </w:pPr>
+      <w:r>
+        <w:rPr>
+          <w:color w:val="1B1B1B"/>
+          <w:sz w:val="21"/>
+          <w:szCs w:val="21"/>
+        </w:rPr>
+        <w:t xml:space="preserve"/>
+      </w:r>
+    </w:p>
+    <w:p>
+      <w:pPr>
+        <w:spacing w:after="40"/>
+      </w:pPr>
+      <w:r>
+        <w:rPr>
+          <w:b/>
+          <w:bCs/>
+          <w:color w:val="1A5FB4"/>
+          <w:sz w:val="17"/>
+          <w:szCs w:val="17"/>
+          <w:spacing w:val="30"/>
+        </w:rPr>
+        <w:t xml:space="preserve">DAY 1 · YOUR PARTS</w:t>
+      </w:r>
+    </w:p>
+    <w:p>
+      <w:pPr>
+        <w:spacing w:after="110" w:line="276"/>
+      </w:pPr>
+      <w:r>
+        <w:rPr>
+          <w:color w:val="1B1B1B"/>
+          <w:sz w:val="21"/>
+          <w:szCs w:val="21"/>
+        </w:rPr>
+        <w:t xml:space="preserve"/>
+      </w:r>
+    </w:p>
+    <w:tbl>
+      <w:tblPr>
+        <w:tblW w:type="dxa" w:w="9360"/>
+        <w:tblBorders>
+          <w:top w:val="single" w:color="10243A" w:sz="8"/>
+          <w:left w:val="single" w:color="10243A" w:sz="8"/>
+          <w:bottom w:val="single" w:color="10243A" w:sz="8"/>
+          <w:right w:val="single" w:color="10243A" w:sz="8"/>
+          <w:insideH w:val="single" w:color="10243A" w:sz="8"/>
+          <w:insideV w:val="single" w:color="10243A" w:sz="8"/>
+        </w:tblBorders>
+      </w:tblPr>
+      <w:tblGrid>
+        <w:gridCol w:w="7100"/>
+        <w:gridCol w:w="2260"/>
+      </w:tblGrid>
+      <w:tr>
+        <w:tc>
+          <w:tcPr>
+            <w:tcW w:type="dxa" w:w="7100"/>
+            <w:shd w:fill="10243A" w:val="clear"/>
+            <w:tcMar>
+              <w:top w:type="dxa" w:w="100"/>
+              <w:left w:type="dxa" w:w="170"/>
+              <w:bottom w:type="dxa" w:w="100"/>
+              <w:right w:type="dxa" w:w="150"/>
+            </w:tcMar>
+          </w:tcPr>
+          <w:p>
+            <w:r>
+              <w:rPr>
+                <w:b/>
+                <w:bCs/>
+                <w:color w:val="FFFFFF"/>
+                <w:sz w:val="17"/>
+                <w:szCs w:val="17"/>
+                <w:spacing w:val="30"/>
+              </w:rPr>
+              <w:t xml:space="preserve">PART 1</w:t>
+            </w:r>
+            <w:r>
+              <w:rPr>
+                <w:b/>
+                <w:bCs/>
+                <w:color w:val="FFFFFF"/>
+                <w:sz w:val="17"/>
+                <w:szCs w:val="17"/>
+                <w:spacing w:val="20"/>
+              </w:rPr>
+              <w:t xml:space="preserve">    THE INTRO</w:t>
+            </w:r>
+          </w:p>
+        </w:tc>
+        <w:tc>
+          <w:tcPr>
+            <w:tcW w:type="dxa" w:w="2260"/>
+            <w:shd w:fill="10243A" w:val="clear"/>
+            <w:tcMar>
+              <w:top w:type="dxa" w:w="100"/>
+              <w:left w:type="dxa" w:w="150"/>
+              <w:bottom w:type="dxa" w:w="100"/>
+              <w:right w:type="dxa" w:w="170"/>
+            </w:tcMar>
+          </w:tcPr>
+          <w:p>
+            <w:pPr>
+              <w:jc w:val="right"/>
+            </w:pPr>
+            <w:r>
+              <w:rPr>
+                <w:b/>
+                <w:bCs/>
+                <w:color w:val="FFFFFF"/>
+                <w:sz w:val="17"/>
+                <w:szCs w:val="17"/>
+                <w:spacing w:val="20"/>
+              </w:rPr>
+              <w:t xml:space="preserve">MIN 0–12</w:t>
+            </w:r>
+          </w:p>
+        </w:tc>
+      </w:tr>
+    </w:tbl>
+    <w:tbl>
+      <w:tblPr>
+        <w:tblW w:type="dxa" w:w="9360"/>
+        <w:tblBorders>
+          <w:top w:val="single" w:color="10243A" w:sz="8"/>
+          <w:left w:val="single" w:color="10243A" w:sz="8"/>
+          <w:bottom w:val="single" w:color="10243A" w:sz="8"/>
+          <w:right w:val="single" w:color="10243A" w:sz="8"/>
+          <w:insideH w:val="single" w:color="10243A" w:sz="8"/>
+          <w:insideV w:val="single" w:color="10243A" w:sz="8"/>
+        </w:tblBorders>
+      </w:tblPr>
+      <w:tblGrid>
+        <w:gridCol w:w="9360"/>
+      </w:tblGrid>
+      <w:tr>
+        <w:tc>
+          <w:tcPr>
+            <w:tcW w:type="dxa" w:w="9360"/>
+            <w:shd w:fill="F2F5F8" w:val="clear"/>
+            <w:tcMar>
+              <w:top w:type="dxa" w:w="110"/>
+              <w:left w:type="dxa" w:w="170"/>
+              <w:bottom w:type="dxa" w:w="110"/>
+              <w:right w:type="dxa" w:w="170"/>
+            </w:tcMar>
+          </w:tcPr>
+          <w:p>
+            <w:pPr>
+              <w:spacing w:after="0" w:line="275"/>
+            </w:pPr>
+            <w:r>
+              <w:rPr>
+                <w:b/>
+                <w:bCs/>
+                <w:color w:val="10243A"/>
+                <w:sz w:val="15"/>
+                <w:szCs w:val="15"/>
+                <w:spacing w:val="20"/>
+              </w:rPr>
+              <w:t xml:space="preserve">CUE   </w:t>
+            </w:r>
+            <w:r>
+              <w:rPr>
+                <w:i/>
+                <w:iCs/>
+                <w:color w:val="5F6B79"/>
+                <w:sz w:val="19"/>
+                <w:szCs w:val="19"/>
+              </w:rPr>
+              <w:t xml:space="preserve">They are seated and have Canvas open. Nothing has been handed out yet.</w:t>
+            </w:r>
+          </w:p>
+        </w:tc>
+      </w:tr>
+      <w:tr>
+        <w:tc>
+          <w:tcPr>
+            <w:tcW w:type="dxa" w:w="9360"/>
+            <w:tcMar>
+              <w:top w:type="dxa" w:w="170"/>
+              <w:left w:type="dxa" w:w="200"/>
+              <w:bottom w:type="dxa" w:w="150"/>
+              <w:right w:type="dxa" w:w="200"/>
+            </w:tcMar>
+          </w:tcPr>
+          <w:p>
+            <w:pPr>
+              <w:spacing w:after="130" w:line="320"/>
+            </w:pPr>
+            <w:r>
+              <w:rPr>
+                <w:color w:val="1B1B1B"/>
+                <w:sz w:val="23"/>
+                <w:szCs w:val="23"/>
+              </w:rPr>
+              <w:t xml:space="preserve">Everybody find two files in Canvas. Case File, and Incident Report.</w:t>
+            </w:r>
+          </w:p>
+          <w:p>
+            <w:pPr>
+              <w:spacing w:after="130" w:line="320"/>
+            </w:pPr>
+            <w:r>
+              <w:rPr>
+                <w:color w:val="1B1B1B"/>
+                <w:sz w:val="23"/>
+                <w:szCs w:val="23"/>
+              </w:rPr>
+              <w:t xml:space="preserve">Here is today. You are the officer who caught this call at one in the morning. By the end of the block you are going to write the report.</w:t>
+            </w:r>
+          </w:p>
+          <w:p>
+            <w:pPr>
+              <w:spacing w:after="130" w:line="320"/>
+            </w:pPr>
+            <w:r>
+              <w:rPr>
+                <w:color w:val="1B1B1B"/>
+                <w:sz w:val="23"/>
+                <w:szCs w:val="23"/>
+              </w:rPr>
+              <w:t xml:space="preserve">One thing before we start. Everything that happens after tonight — the arrest, the charge, the trial, whether somebody gets convicted or walks — all of it runs on the report you write. Not on what you remember. On what you wrote down.</w:t>
+            </w:r>
+          </w:p>
+          <w:p>
+            <w:pPr>
+              <w:spacing w:after="130" w:line="320"/>
+            </w:pPr>
+            <w:r>
+              <w:rPr>
+                <w:color w:val="1B1B1B"/>
+                <w:sz w:val="23"/>
+                <w:szCs w:val="23"/>
+              </w:rPr>
+              <w:t xml:space="preserve">And you will never be in the room when it gets read. A detective reads it next week. A prosecutor reads it next month. A defence attorney reads it looking for a hole. A jury might read it in two years.</w:t>
+            </w:r>
+          </w:p>
+          <w:p>
+            <w:pPr>
+              <w:spacing w:after="130" w:line="320"/>
+            </w:pPr>
+            <w:r>
+              <w:rPr>
+                <w:color w:val="1B1B1B"/>
+                <w:sz w:val="23"/>
+                <w:szCs w:val="23"/>
+              </w:rPr>
+              <w:t xml:space="preserve">You are not there to explain what you meant. So it has to work without you.</w:t>
+            </w:r>
+          </w:p>
+        </w:tc>
+      </w:tr>
+    </w:tbl>
+    <w:p>
+      <w:pPr>
+        <w:spacing w:after="230" w:line="276"/>
+      </w:pPr>
+      <w:r>
+        <w:rPr>
+          <w:color w:val="1B1B1B"/>
+          <w:sz w:val="21"/>
+          <w:szCs w:val="21"/>
+        </w:rPr>
+        <w:t xml:space="preserve"/>
+      </w:r>
+    </w:p>
+    <w:tbl>
+      <w:tblPr>
+        <w:tblW w:type="dxa" w:w="9360"/>
+        <w:tblBorders>
+          <w:top w:val="single" w:color="10243A" w:sz="8"/>
+          <w:left w:val="single" w:color="10243A" w:sz="8"/>
+          <w:bottom w:val="single" w:color="10243A" w:sz="8"/>
+          <w:right w:val="single" w:color="10243A" w:sz="8"/>
+          <w:insideH w:val="single" w:color="10243A" w:sz="8"/>
+          <w:insideV w:val="single" w:color="10243A" w:sz="8"/>
+        </w:tblBorders>
+      </w:tblPr>
+      <w:tblGrid>
+        <w:gridCol w:w="7100"/>
+        <w:gridCol w:w="2260"/>
+      </w:tblGrid>
+      <w:tr>
+        <w:tc>
+          <w:tcPr>
+            <w:tcW w:type="dxa" w:w="7100"/>
+            <w:shd w:fill="10243A" w:val="clear"/>
+            <w:tcMar>
+              <w:top w:type="dxa" w:w="100"/>
+              <w:left w:type="dxa" w:w="170"/>
+              <w:bottom w:type="dxa" w:w="100"/>
+              <w:right w:type="dxa" w:w="150"/>
+            </w:tcMar>
+          </w:tcPr>
+          <w:p>
+            <w:r>
+              <w:rPr>
+                <w:b/>
+                <w:bCs/>
+                <w:color w:val="FFFFFF"/>
+                <w:sz w:val="17"/>
+                <w:szCs w:val="17"/>
+                <w:spacing w:val="30"/>
+              </w:rPr>
+              <w:t xml:space="preserve">PART 2</w:t>
+            </w:r>
+            <w:r>
+              <w:rPr>
+                <w:b/>
+                <w:bCs/>
+                <w:color w:val="FFFFFF"/>
+                <w:sz w:val="17"/>
+                <w:szCs w:val="17"/>
+                <w:spacing w:val="20"/>
+              </w:rPr>
+              <w:t xml:space="preserve">    THE WALK-THROUGH</w:t>
+            </w:r>
+          </w:p>
+        </w:tc>
+        <w:tc>
+          <w:tcPr>
+            <w:tcW w:type="dxa" w:w="2260"/>
+            <w:shd w:fill="10243A" w:val="clear"/>
+            <w:tcMar>
+              <w:top w:type="dxa" w:w="100"/>
+              <w:left w:type="dxa" w:w="150"/>
+              <w:bottom w:type="dxa" w:w="100"/>
+              <w:right w:type="dxa" w:w="170"/>
+            </w:tcMar>
+          </w:tcPr>
+          <w:p>
+            <w:pPr>
+              <w:jc w:val="right"/>
+            </w:pPr>
+            <w:r>
+              <w:rPr>
+                <w:b/>
+                <w:bCs/>
+                <w:color w:val="FFFFFF"/>
+                <w:sz w:val="17"/>
+                <w:szCs w:val="17"/>
+                <w:spacing w:val="20"/>
+              </w:rPr>
+              <w:t xml:space="preserve">MIN 12–25</w:t>
+            </w:r>
+          </w:p>
+        </w:tc>
+      </w:tr>
+    </w:tbl>
+    <w:tbl>
+      <w:tblPr>
+        <w:tblW w:type="dxa" w:w="9360"/>
+        <w:tblBorders>
+          <w:top w:val="single" w:color="10243A" w:sz="8"/>
+          <w:left w:val="single" w:color="10243A" w:sz="8"/>
+          <w:bottom w:val="single" w:color="10243A" w:sz="8"/>
+          <w:right w:val="single" w:color="10243A" w:sz="8"/>
+          <w:insideH w:val="single" w:color="10243A" w:sz="8"/>
+          <w:insideV w:val="single" w:color="10243A" w:sz="8"/>
+        </w:tblBorders>
+      </w:tblPr>
+      <w:tblGrid>
+        <w:gridCol w:w="9360"/>
+      </w:tblGrid>
+      <w:tr>
+        <w:tc>
+          <w:tcPr>
+            <w:tcW w:type="dxa" w:w="9360"/>
+            <w:shd w:fill="F2F5F8" w:val="clear"/>
+            <w:tcMar>
+              <w:top w:type="dxa" w:w="110"/>
+              <w:left w:type="dxa" w:w="170"/>
+              <w:bottom w:type="dxa" w:w="110"/>
+              <w:right w:type="dxa" w:w="170"/>
+            </w:tcMar>
+          </w:tcPr>
+          <w:p>
+            <w:pPr>
+              <w:spacing w:after="0" w:line="275"/>
+            </w:pPr>
+            <w:r>
+              <w:rPr>
+                <w:b/>
+                <w:bCs/>
+                <w:color w:val="10243A"/>
+                <w:sz w:val="15"/>
+                <w:szCs w:val="15"/>
+                <w:spacing w:val="20"/>
+              </w:rPr>
+              <w:t xml:space="preserve">CUE   </w:t>
+            </w:r>
+            <w:r>
+              <w:rPr>
+                <w:i/>
+                <w:iCs/>
+                <w:color w:val="5F6B79"/>
+                <w:sz w:val="19"/>
+                <w:szCs w:val="19"/>
+              </w:rPr>
+              <w:t xml:space="preserve">Incident Report form up on the board. They are looking, not writing.</w:t>
+            </w:r>
+          </w:p>
+        </w:tc>
+      </w:tr>
+      <w:tr>
+        <w:tc>
+          <w:tcPr>
+            <w:tcW w:type="dxa" w:w="9360"/>
+            <w:tcMar>
+              <w:top w:type="dxa" w:w="170"/>
+              <w:left w:type="dxa" w:w="200"/>
+              <w:bottom w:type="dxa" w:w="150"/>
+              <w:right w:type="dxa" w:w="200"/>
+            </w:tcMar>
+          </w:tcPr>
+          <w:p>
+            <w:pPr>
+              <w:spacing w:after="130" w:line="320"/>
+            </w:pPr>
+            <w:r>
+              <w:rPr>
+                <w:color w:val="1B1B1B"/>
+                <w:sz w:val="23"/>
+                <w:szCs w:val="23"/>
+              </w:rPr>
+              <w:t xml:space="preserve">Open the Incident Report. Do not write anything yet, just look at it.</w:t>
+            </w:r>
+          </w:p>
+          <w:p>
+            <w:pPr>
+              <w:spacing w:after="130" w:line="320"/>
+            </w:pPr>
+            <w:r>
+              <w:rPr>
+                <w:color w:val="1B1B1B"/>
+                <w:sz w:val="23"/>
+                <w:szCs w:val="23"/>
+              </w:rPr>
+              <w:t xml:space="preserve">Five blocks. Block 1 is administrative — when, where, what kind of call. Block 2 is persons, everybody involved and how to find them again. Block 3 is property and evidence. Block 4 is the narrative, that is the story. Block 5 is status, which is just: is this case finished or not.</w:t>
+            </w:r>
+          </w:p>
+          <w:p>
+            <w:pPr>
+              <w:spacing w:after="130" w:line="320"/>
+            </w:pPr>
+            <w:r>
+              <w:rPr>
+                <w:color w:val="1B1B1B"/>
+                <w:sz w:val="23"/>
+                <w:szCs w:val="23"/>
+              </w:rPr>
+              <w:t xml:space="preserve">Every block has one job. If you put something in the wrong block, the person who needs it will not find it. That is the whole reason the form looks like this.</w:t>
+            </w:r>
+          </w:p>
+        </w:tc>
+      </w:tr>
+    </w:tbl>
+    <w:p>
+      <w:pPr>
+        <w:spacing w:after="230" w:line="276"/>
+      </w:pPr>
+      <w:r>
+        <w:rPr>
+          <w:color w:val="1B1B1B"/>
+          <w:sz w:val="21"/>
+          <w:szCs w:val="21"/>
+        </w:rPr>
+        <w:t xml:space="preserve"/>
+      </w:r>
+    </w:p>
+    <w:tbl>
+      <w:tblPr>
+        <w:tblW w:type="dxa" w:w="9360"/>
+        <w:tblBorders>
+          <w:top w:val="single" w:color="10243A" w:sz="8"/>
+          <w:left w:val="single" w:color="10243A" w:sz="8"/>
+          <w:bottom w:val="single" w:color="10243A" w:sz="8"/>
+          <w:right w:val="single" w:color="10243A" w:sz="8"/>
+          <w:insideH w:val="single" w:color="10243A" w:sz="8"/>
+          <w:insideV w:val="single" w:color="10243A" w:sz="8"/>
+        </w:tblBorders>
+      </w:tblPr>
+      <w:tblGrid>
+        <w:gridCol w:w="7100"/>
+        <w:gridCol w:w="2260"/>
+      </w:tblGrid>
+      <w:tr>
+        <w:tc>
+          <w:tcPr>
+            <w:tcW w:type="dxa" w:w="7100"/>
+            <w:shd w:fill="10243A" w:val="clear"/>
+            <w:tcMar>
+              <w:top w:type="dxa" w:w="100"/>
+              <w:left w:type="dxa" w:w="170"/>
+              <w:bottom w:type="dxa" w:w="100"/>
+              <w:right w:type="dxa" w:w="150"/>
+            </w:tcMar>
+          </w:tcPr>
+          <w:p>
+            <w:r>
+              <w:rPr>
+                <w:b/>
+                <w:bCs/>
+                <w:color w:val="FFFFFF"/>
+                <w:sz w:val="17"/>
+                <w:szCs w:val="17"/>
+                <w:spacing w:val="30"/>
+              </w:rPr>
+              <w:t xml:space="preserve">PART 3</w:t>
+            </w:r>
+            <w:r>
+              <w:rPr>
+                <w:b/>
+                <w:bCs/>
+                <w:color w:val="FFFFFF"/>
+                <w:sz w:val="17"/>
+                <w:szCs w:val="17"/>
+                <w:spacing w:val="20"/>
+              </w:rPr>
+              <w:t xml:space="preserve">    HANDING OFF TO RAY</w:t>
+            </w:r>
+          </w:p>
+        </w:tc>
+        <w:tc>
+          <w:tcPr>
+            <w:tcW w:type="dxa" w:w="2260"/>
+            <w:shd w:fill="10243A" w:val="clear"/>
+            <w:tcMar>
+              <w:top w:type="dxa" w:w="100"/>
+              <w:left w:type="dxa" w:w="150"/>
+              <w:bottom w:type="dxa" w:w="100"/>
+              <w:right w:type="dxa" w:w="170"/>
+            </w:tcMar>
+          </w:tcPr>
+          <w:p>
+            <w:pPr>
+              <w:jc w:val="right"/>
+            </w:pPr>
+            <w:r>
+              <w:rPr>
+                <w:b/>
+                <w:bCs/>
+                <w:color w:val="FFFFFF"/>
+                <w:sz w:val="17"/>
+                <w:szCs w:val="17"/>
+                <w:spacing w:val="20"/>
+              </w:rPr>
+              <w:t xml:space="preserve">MIN 25–35</w:t>
+            </w:r>
+          </w:p>
+        </w:tc>
+      </w:tr>
+    </w:tbl>
+    <w:tbl>
+      <w:tblPr>
+        <w:tblW w:type="dxa" w:w="9360"/>
+        <w:tblBorders>
+          <w:top w:val="single" w:color="10243A" w:sz="8"/>
+          <w:left w:val="single" w:color="10243A" w:sz="8"/>
+          <w:bottom w:val="single" w:color="10243A" w:sz="8"/>
+          <w:right w:val="single" w:color="10243A" w:sz="8"/>
+          <w:insideH w:val="single" w:color="10243A" w:sz="8"/>
+          <w:insideV w:val="single" w:color="10243A" w:sz="8"/>
+        </w:tblBorders>
+      </w:tblPr>
+      <w:tblGrid>
+        <w:gridCol w:w="9360"/>
+      </w:tblGrid>
+      <w:tr>
+        <w:tc>
+          <w:tcPr>
+            <w:tcW w:type="dxa" w:w="9360"/>
+            <w:shd w:fill="F2F5F8" w:val="clear"/>
+            <w:tcMar>
+              <w:top w:type="dxa" w:w="110"/>
+              <w:left w:type="dxa" w:w="170"/>
+              <w:bottom w:type="dxa" w:w="110"/>
+              <w:right w:type="dxa" w:w="170"/>
+            </w:tcMar>
+          </w:tcPr>
+          <w:p>
+            <w:pPr>
+              <w:spacing w:after="0" w:line="275"/>
+            </w:pPr>
+            <w:r>
+              <w:rPr>
+                <w:b/>
+                <w:bCs/>
+                <w:color w:val="10243A"/>
+                <w:sz w:val="15"/>
+                <w:szCs w:val="15"/>
+                <w:spacing w:val="20"/>
+              </w:rPr>
+              <w:t xml:space="preserve">CUE   </w:t>
+            </w:r>
+            <w:r>
+              <w:rPr>
+                <w:i/>
+                <w:iCs/>
+                <w:color w:val="5F6B79"/>
+                <w:sz w:val="19"/>
+                <w:szCs w:val="19"/>
+              </w:rPr>
+              <w:t xml:space="preserve">Switch the board to the Case File. Pick a reader before you start.</w:t>
+            </w:r>
+          </w:p>
+        </w:tc>
+      </w:tr>
+      <w:tr>
+        <w:tc>
+          <w:tcPr>
+            <w:tcW w:type="dxa" w:w="9360"/>
+            <w:tcMar>
+              <w:top w:type="dxa" w:w="170"/>
+              <w:left w:type="dxa" w:w="200"/>
+              <w:bottom w:type="dxa" w:w="150"/>
+              <w:right w:type="dxa" w:w="200"/>
+            </w:tcMar>
+          </w:tcPr>
+          <w:p>
+            <w:pPr>
+              <w:spacing w:after="130" w:line="320"/>
+            </w:pPr>
+            <w:r>
+              <w:rPr>
+                <w:color w:val="1B1B1B"/>
+                <w:sz w:val="23"/>
+                <w:szCs w:val="23"/>
+              </w:rPr>
+              <w:t xml:space="preserve">Now the Case File. This is everything you know. There is no more.</w:t>
+            </w:r>
+          </w:p>
+          <w:p>
+            <w:pPr>
+              <w:spacing w:before="60" w:after="110" w:line="280"/>
+              <w:ind w:left="300"/>
+            </w:pPr>
+            <w:r>
+              <w:rPr>
+                <w:i/>
+                <w:iCs/>
+                <w:color w:val="5F6B79"/>
+                <w:sz w:val="19"/>
+                <w:szCs w:val="19"/>
+              </w:rPr>
+              <w:t xml:space="preserve">Student reads the dispatch box, then all four of Delgado’s paragraphs. Slowly.</w:t>
+            </w:r>
+          </w:p>
+          <w:p>
+            <w:pPr>
+              <w:spacing w:after="130" w:line="320"/>
+            </w:pPr>
+            <w:r>
+              <w:rPr>
+                <w:color w:val="1B1B1B"/>
+                <w:sz w:val="23"/>
+                <w:szCs w:val="23"/>
+              </w:rPr>
+              <w:t xml:space="preserve">Okay. Again.</w:t>
+            </w:r>
+          </w:p>
+          <w:p>
+            <w:pPr>
+              <w:spacing w:after="130" w:line="320"/>
+            </w:pPr>
+            <w:r>
+              <w:rPr>
+                <w:color w:val="1B1B1B"/>
+                <w:sz w:val="23"/>
+                <w:szCs w:val="23"/>
+              </w:rPr>
+              <w:t xml:space="preserve">And this time, listen for what he does not say.</w:t>
+            </w:r>
+          </w:p>
+          <w:p>
+            <w:pPr>
+              <w:spacing w:before="60" w:after="110" w:line="280"/>
+              <w:ind w:left="300"/>
+            </w:pPr>
+            <w:r>
+              <w:rPr>
+                <w:i/>
+                <w:iCs/>
+                <w:color w:val="5F6B79"/>
+                <w:sz w:val="19"/>
+                <w:szCs w:val="19"/>
+              </w:rPr>
+              <w:t xml:space="preserve">Second read. Do not comment between them.</w:t>
+            </w:r>
+          </w:p>
+        </w:tc>
+      </w:tr>
+    </w:tbl>
+    <w:p>
+      <w:pPr>
+        <w:spacing w:after="230" w:line="276"/>
+      </w:pPr>
+      <w:r>
+        <w:rPr>
+          <w:color w:val="1B1B1B"/>
+          <w:sz w:val="21"/>
+          <w:szCs w:val="21"/>
+        </w:rPr>
+        <w:t xml:space="preserve"/>
+      </w:r>
+    </w:p>
+    <w:tbl>
+      <w:tblPr>
+        <w:tblW w:type="dxa" w:w="9360"/>
+        <w:tblBorders>
+          <w:top w:val="single" w:color="10243A" w:sz="8"/>
+          <w:left w:val="single" w:color="10243A" w:sz="8"/>
+          <w:bottom w:val="single" w:color="10243A" w:sz="8"/>
+          <w:right w:val="single" w:color="10243A" w:sz="8"/>
+          <w:insideH w:val="single" w:color="10243A" w:sz="8"/>
+          <w:insideV w:val="single" w:color="10243A" w:sz="8"/>
+        </w:tblBorders>
+      </w:tblPr>
+      <w:tblGrid>
+        <w:gridCol w:w="7100"/>
+        <w:gridCol w:w="2260"/>
+      </w:tblGrid>
+      <w:tr>
+        <w:tc>
+          <w:tcPr>
+            <w:tcW w:type="dxa" w:w="7100"/>
+            <w:shd w:fill="10243A" w:val="clear"/>
+            <w:tcMar>
+              <w:top w:type="dxa" w:w="100"/>
+              <w:left w:type="dxa" w:w="170"/>
+              <w:bottom w:type="dxa" w:w="100"/>
+              <w:right w:type="dxa" w:w="150"/>
+            </w:tcMar>
+          </w:tcPr>
+          <w:p>
+            <w:r>
+              <w:rPr>
+                <w:b/>
+                <w:bCs/>
+                <w:color w:val="FFFFFF"/>
+                <w:sz w:val="17"/>
+                <w:szCs w:val="17"/>
+                <w:spacing w:val="30"/>
+              </w:rPr>
+              <w:t xml:space="preserve">PART 4</w:t>
+            </w:r>
+            <w:r>
+              <w:rPr>
+                <w:b/>
+                <w:bCs/>
+                <w:color w:val="FFFFFF"/>
+                <w:sz w:val="17"/>
+                <w:szCs w:val="17"/>
+                <w:spacing w:val="20"/>
+              </w:rPr>
+              <w:t xml:space="preserve">    THE MODEL — BLOCK 1 TOGETHER</w:t>
+            </w:r>
+          </w:p>
+        </w:tc>
+        <w:tc>
+          <w:tcPr>
+            <w:tcW w:type="dxa" w:w="2260"/>
+            <w:shd w:fill="10243A" w:val="clear"/>
+            <w:tcMar>
+              <w:top w:type="dxa" w:w="100"/>
+              <w:left w:type="dxa" w:w="150"/>
+              <w:bottom w:type="dxa" w:w="100"/>
+              <w:right w:type="dxa" w:w="170"/>
+            </w:tcMar>
+          </w:tcPr>
+          <w:p>
+            <w:pPr>
+              <w:jc w:val="right"/>
+            </w:pPr>
+            <w:r>
+              <w:rPr>
+                <w:b/>
+                <w:bCs/>
+                <w:color w:val="FFFFFF"/>
+                <w:sz w:val="17"/>
+                <w:szCs w:val="17"/>
+                <w:spacing w:val="20"/>
+              </w:rPr>
+              <w:t xml:space="preserve">MIN 35–42</w:t>
+            </w:r>
+          </w:p>
+        </w:tc>
+      </w:tr>
+    </w:tbl>
+    <w:tbl>
+      <w:tblPr>
+        <w:tblW w:type="dxa" w:w="9360"/>
+        <w:tblBorders>
+          <w:top w:val="single" w:color="10243A" w:sz="8"/>
+          <w:left w:val="single" w:color="10243A" w:sz="8"/>
+          <w:bottom w:val="single" w:color="10243A" w:sz="8"/>
+          <w:right w:val="single" w:color="10243A" w:sz="8"/>
+          <w:insideH w:val="single" w:color="10243A" w:sz="8"/>
+          <w:insideV w:val="single" w:color="10243A" w:sz="8"/>
+        </w:tblBorders>
+      </w:tblPr>
+      <w:tblGrid>
+        <w:gridCol w:w="9360"/>
+      </w:tblGrid>
+      <w:tr>
+        <w:tc>
+          <w:tcPr>
+            <w:tcW w:type="dxa" w:w="9360"/>
+            <w:shd w:fill="F2F5F8" w:val="clear"/>
+            <w:tcMar>
+              <w:top w:type="dxa" w:w="110"/>
+              <w:left w:type="dxa" w:w="170"/>
+              <w:bottom w:type="dxa" w:w="110"/>
+              <w:right w:type="dxa" w:w="170"/>
+            </w:tcMar>
+          </w:tcPr>
+          <w:p>
+            <w:pPr>
+              <w:spacing w:after="0" w:line="275"/>
+            </w:pPr>
+            <w:r>
+              <w:rPr>
+                <w:b/>
+                <w:bCs/>
+                <w:color w:val="10243A"/>
+                <w:sz w:val="15"/>
+                <w:szCs w:val="15"/>
+                <w:spacing w:val="20"/>
+              </w:rPr>
+              <w:t xml:space="preserve">CUE   </w:t>
+            </w:r>
+            <w:r>
+              <w:rPr>
+                <w:i/>
+                <w:iCs/>
+                <w:color w:val="5F6B79"/>
+                <w:sz w:val="19"/>
+                <w:szCs w:val="19"/>
+              </w:rPr>
+              <w:t xml:space="preserve">You are filling Block 1 on the board with them. The whole point is the offence-type argument. Let it run.</w:t>
+            </w:r>
+          </w:p>
+        </w:tc>
+      </w:tr>
+      <w:tr>
+        <w:tc>
+          <w:tcPr>
+            <w:tcW w:type="dxa" w:w="9360"/>
+            <w:tcMar>
+              <w:top w:type="dxa" w:w="170"/>
+              <w:left w:type="dxa" w:w="200"/>
+              <w:bottom w:type="dxa" w:w="150"/>
+              <w:right w:type="dxa" w:w="200"/>
+            </w:tcMar>
+          </w:tcPr>
+          <w:p>
+            <w:pPr>
+              <w:spacing w:after="130" w:line="320"/>
+            </w:pPr>
+            <w:r>
+              <w:rPr>
+                <w:color w:val="1B1B1B"/>
+                <w:sz w:val="23"/>
+                <w:szCs w:val="23"/>
+              </w:rPr>
+              <w:t xml:space="preserve">Block 1, with me. Case number — we were not given one, leave it. Date and time reported — that is in the dispatch box, not from Ray.</w:t>
+            </w:r>
+          </w:p>
+          <w:p>
+            <w:pPr>
+              <w:spacing w:after="130" w:line="320"/>
+            </w:pPr>
+            <w:r>
+              <w:rPr>
+                <w:color w:val="1B1B1B"/>
+                <w:sz w:val="23"/>
+                <w:szCs w:val="23"/>
+              </w:rPr>
+              <w:t xml:space="preserve">Offence type. What is this?</w:t>
+            </w:r>
+          </w:p>
+          <w:p>
+            <w:pPr>
+              <w:spacing w:before="60" w:after="110" w:line="280"/>
+              <w:ind w:left="300"/>
+            </w:pPr>
+            <w:r>
+              <w:rPr>
+                <w:i/>
+                <w:iCs/>
+                <w:color w:val="5F6B79"/>
+                <w:sz w:val="19"/>
+                <w:szCs w:val="19"/>
+              </w:rPr>
+              <w:t xml:space="preserve">Somebody says burglary. They always do.</w:t>
+            </w:r>
+          </w:p>
+          <w:p>
+            <w:pPr>
+              <w:spacing w:after="130" w:line="320"/>
+            </w:pPr>
+            <w:r>
+              <w:rPr>
+                <w:color w:val="1B1B1B"/>
+                <w:sz w:val="23"/>
+                <w:szCs w:val="23"/>
+              </w:rPr>
+              <w:t xml:space="preserve">Prove it. Burglary needs two things: somebody got in, and they got in intending to commit a crime. Which sentence in the Case File proves somebody got in?</w:t>
+            </w:r>
+          </w:p>
+          <w:p>
+            <w:pPr>
+              <w:spacing w:before="60" w:after="110" w:line="280"/>
+              <w:ind w:left="300"/>
+            </w:pPr>
+            <w:r>
+              <w:rPr>
+                <w:i/>
+                <w:iCs/>
+                <w:color w:val="5F6B79"/>
+                <w:sz w:val="19"/>
+                <w:szCs w:val="19"/>
+              </w:rPr>
+              <w:t xml:space="preserve">Let them hunt. There is not one.</w:t>
+            </w:r>
+          </w:p>
+          <w:p>
+            <w:pPr>
+              <w:spacing w:after="130" w:line="320"/>
+            </w:pPr>
+            <w:r>
+              <w:rPr>
+                <w:color w:val="1B1B1B"/>
+                <w:sz w:val="23"/>
+                <w:szCs w:val="23"/>
+              </w:rPr>
+              <w:t xml:space="preserve">Nobody saw anybody. Ray never went in the room. So what can you actually write?</w:t>
+            </w:r>
+          </w:p>
+          <w:p>
+            <w:pPr>
+              <w:spacing w:before="60" w:after="110" w:line="280"/>
+              <w:ind w:left="300"/>
+            </w:pPr>
+            <w:r>
+              <w:rPr>
+                <w:i/>
+                <w:iCs/>
+                <w:color w:val="5F6B79"/>
+                <w:sz w:val="19"/>
+                <w:szCs w:val="19"/>
+              </w:rPr>
+              <w:t xml:space="preserve">Take suggestions until you land on something defensible.</w:t>
+            </w:r>
+          </w:p>
+          <w:p>
+            <w:pPr>
+              <w:spacing w:after="130" w:line="320"/>
+            </w:pPr>
+            <w:r>
+              <w:rPr>
+                <w:color w:val="1B1B1B"/>
+                <w:sz w:val="23"/>
+                <w:szCs w:val="23"/>
+              </w:rPr>
+              <w:t xml:space="preserve">Here is the rule for the rest of the day. If you cannot support the word, you do not get to use the word.</w:t>
+            </w:r>
+          </w:p>
+        </w:tc>
+      </w:tr>
+    </w:tbl>
+    <w:p>
+      <w:pPr>
+        <w:spacing w:after="230" w:line="276"/>
+      </w:pPr>
+      <w:r>
+        <w:rPr>
+          <w:color w:val="1B1B1B"/>
+          <w:sz w:val="21"/>
+          <w:szCs w:val="21"/>
+        </w:rPr>
+        <w:t xml:space="preserve"/>
+      </w:r>
+    </w:p>
+    <w:tbl>
+      <w:tblPr>
+        <w:tblW w:type="dxa" w:w="9360"/>
+        <w:tblBorders>
+          <w:top w:val="single" w:color="9A3412" w:sz="8"/>
+          <w:left w:val="single" w:color="9A3412" w:sz="8"/>
+          <w:bottom w:val="single" w:color="9A3412" w:sz="8"/>
+          <w:right w:val="single" w:color="9A3412" w:sz="8"/>
+          <w:insideH w:val="single" w:color="9A3412" w:sz="8"/>
+          <w:insideV w:val="single" w:color="9A3412" w:sz="8"/>
+        </w:tblBorders>
+      </w:tblPr>
+      <w:tblGrid>
+        <w:gridCol w:w="7100"/>
+        <w:gridCol w:w="2260"/>
+      </w:tblGrid>
+      <w:tr>
+        <w:tc>
+          <w:tcPr>
+            <w:tcW w:type="dxa" w:w="7100"/>
+            <w:shd w:fill="9A3412" w:val="clear"/>
+            <w:tcMar>
+              <w:top w:type="dxa" w:w="100"/>
+              <w:left w:type="dxa" w:w="170"/>
+              <w:bottom w:type="dxa" w:w="100"/>
+              <w:right w:type="dxa" w:w="150"/>
+            </w:tcMar>
+          </w:tcPr>
+          <w:p>
+            <w:r>
+              <w:rPr>
+                <w:b/>
+                <w:bCs/>
+                <w:color w:val="FFFFFF"/>
+                <w:sz w:val="17"/>
+                <w:szCs w:val="17"/>
+                <w:spacing w:val="30"/>
+              </w:rPr>
+              <w:t xml:space="preserve">PART 5</w:t>
+            </w:r>
+            <w:r>
+              <w:rPr>
+                <w:b/>
+                <w:bCs/>
+                <w:color w:val="FFFFFF"/>
+                <w:sz w:val="17"/>
+                <w:szCs w:val="17"/>
+                <w:spacing w:val="20"/>
+              </w:rPr>
+              <w:t xml:space="preserve">    SEND-OFF — ASSIGNMENT 1</w:t>
+            </w:r>
+          </w:p>
+        </w:tc>
+        <w:tc>
+          <w:tcPr>
+            <w:tcW w:type="dxa" w:w="2260"/>
+            <w:shd w:fill="9A3412" w:val="clear"/>
+            <w:tcMar>
+              <w:top w:type="dxa" w:w="100"/>
+              <w:left w:type="dxa" w:w="150"/>
+              <w:bottom w:type="dxa" w:w="100"/>
+              <w:right w:type="dxa" w:w="170"/>
+            </w:tcMar>
+          </w:tcPr>
+          <w:p>
+            <w:pPr>
+              <w:jc w:val="right"/>
+            </w:pPr>
+            <w:r>
+              <w:rPr>
+                <w:b/>
+                <w:bCs/>
+                <w:color w:val="FFFFFF"/>
+                <w:sz w:val="17"/>
+                <w:szCs w:val="17"/>
+                <w:spacing w:val="20"/>
+              </w:rPr>
+              <w:t xml:space="preserve">MIN 42</w:t>
+            </w:r>
+          </w:p>
+        </w:tc>
+      </w:tr>
+    </w:tbl>
+    <w:tbl>
+      <w:tblPr>
+        <w:tblW w:type="dxa" w:w="9360"/>
+        <w:tblBorders>
+          <w:top w:val="single" w:color="9A3412" w:sz="8"/>
+          <w:left w:val="single" w:color="9A3412" w:sz="8"/>
+          <w:bottom w:val="single" w:color="9A3412" w:sz="8"/>
+          <w:right w:val="single" w:color="9A3412" w:sz="8"/>
+          <w:insideH w:val="single" w:color="9A3412" w:sz="8"/>
+          <w:insideV w:val="single" w:color="9A3412" w:sz="8"/>
+        </w:tblBorders>
+      </w:tblPr>
+      <w:tblGrid>
+        <w:gridCol w:w="9360"/>
+      </w:tblGrid>
+      <w:tr>
+        <w:tc>
+          <w:tcPr>
+            <w:tcW w:type="dxa" w:w="9360"/>
+            <w:shd w:fill="FDF3EC" w:val="clear"/>
+            <w:tcMar>
+              <w:top w:type="dxa" w:w="110"/>
+              <w:left w:type="dxa" w:w="170"/>
+              <w:bottom w:type="dxa" w:w="110"/>
+              <w:right w:type="dxa" w:w="170"/>
+            </w:tcMar>
+          </w:tcPr>
+          <w:p>
+            <w:pPr>
+              <w:spacing w:after="0" w:line="275"/>
+            </w:pPr>
+            <w:r>
+              <w:rPr>
+                <w:b/>
+                <w:bCs/>
+                <w:color w:val="9A3412"/>
+                <w:sz w:val="15"/>
+                <w:szCs w:val="15"/>
+                <w:spacing w:val="20"/>
+              </w:rPr>
+              <w:t xml:space="preserve">CUE   </w:t>
+            </w:r>
+            <w:r>
+              <w:rPr>
+                <w:i/>
+                <w:iCs/>
+                <w:color w:val="5F6B79"/>
+                <w:sz w:val="19"/>
+                <w:szCs w:val="19"/>
+              </w:rPr>
+              <w:t xml:space="preserve">Turning them loose on the Incident Report form. Thirty minutes.</w:t>
+            </w:r>
+          </w:p>
+        </w:tc>
+      </w:tr>
+      <w:tr>
+        <w:tc>
+          <w:tcPr>
+            <w:tcW w:type="dxa" w:w="9360"/>
+            <w:tcMar>
+              <w:top w:type="dxa" w:w="170"/>
+              <w:left w:type="dxa" w:w="200"/>
+              <w:bottom w:type="dxa" w:w="150"/>
+              <w:right w:type="dxa" w:w="200"/>
+            </w:tcMar>
+          </w:tcPr>
+          <w:p>
+            <w:pPr>
+              <w:spacing w:after="130" w:line="320"/>
+            </w:pPr>
+            <w:r>
+              <w:rPr>
+                <w:color w:val="1B1B1B"/>
+                <w:sz w:val="23"/>
+                <w:szCs w:val="23"/>
+              </w:rPr>
+              <w:t xml:space="preserve">You have got thirty minutes. Blocks 1 through 5.</w:t>
+            </w:r>
+          </w:p>
+          <w:p>
+            <w:pPr>
+              <w:spacing w:after="130" w:line="320"/>
+            </w:pPr>
+            <w:r>
+              <w:rPr>
+                <w:color w:val="1B1B1B"/>
+                <w:sz w:val="23"/>
+                <w:szCs w:val="23"/>
+              </w:rPr>
+              <w:t xml:space="preserve">Two rules.</w:t>
+            </w:r>
+          </w:p>
+          <w:p>
+            <w:pPr>
+              <w:spacing w:after="130" w:line="320"/>
+            </w:pPr>
+            <w:r>
+              <w:rPr>
+                <w:color w:val="1B1B1B"/>
+                <w:sz w:val="23"/>
+                <w:szCs w:val="23"/>
+              </w:rPr>
+              <w:t xml:space="preserve">One. Only what is in the Case File. If it is not on that page, you do not know it.</w:t>
+            </w:r>
+          </w:p>
+          <w:p>
+            <w:pPr>
+              <w:spacing w:after="130" w:line="320"/>
+            </w:pPr>
+            <w:r>
+              <w:rPr>
+                <w:color w:val="1B1B1B"/>
+                <w:sz w:val="23"/>
+                <w:szCs w:val="23"/>
+              </w:rPr>
+              <w:t xml:space="preserve">Two. If you cannot fill a field, leave it blank. Do not guess, do not estimate, do not write “unknown” unless you actually mean it. Blank is a real answer.</w:t>
+            </w:r>
+          </w:p>
+          <w:p>
+            <w:pPr>
+              <w:spacing w:after="130" w:line="320"/>
+            </w:pPr>
+            <w:r>
+              <w:rPr>
+                <w:color w:val="1B1B1B"/>
+                <w:sz w:val="23"/>
+                <w:szCs w:val="23"/>
+              </w:rPr>
+              <w:t xml:space="preserve">And somebody is going to put their hand up and ask me “can I just put —” and the answer is no. Leave it blank.</w:t>
+            </w:r>
+          </w:p>
+          <w:p>
+            <w:pPr>
+              <w:spacing w:after="130" w:line="320"/>
+            </w:pPr>
+            <w:r>
+              <w:rPr>
+                <w:color w:val="1B1B1B"/>
+                <w:sz w:val="23"/>
+                <w:szCs w:val="23"/>
+              </w:rPr>
+              <w:t xml:space="preserve">Go.</w:t>
+            </w:r>
+          </w:p>
+        </w:tc>
+      </w:tr>
+    </w:tbl>
+    <w:p>
+      <w:pPr>
+        <w:spacing w:after="230" w:line="276"/>
+      </w:pPr>
+      <w:r>
+        <w:rPr>
+          <w:color w:val="1B1B1B"/>
+          <w:sz w:val="21"/>
+          <w:szCs w:val="21"/>
+        </w:rPr>
+        <w:t xml:space="preserve"/>
+      </w:r>
+    </w:p>
+    <w:tbl>
+      <w:tblPr>
+        <w:tblW w:type="dxa" w:w="9360"/>
+        <w:tblBorders>
+          <w:top w:val="single" w:color="10243A" w:sz="8"/>
+          <w:left w:val="single" w:color="10243A" w:sz="8"/>
+          <w:bottom w:val="single" w:color="10243A" w:sz="8"/>
+          <w:right w:val="single" w:color="10243A" w:sz="8"/>
+          <w:insideH w:val="single" w:color="10243A" w:sz="8"/>
+          <w:insideV w:val="single" w:color="10243A" w:sz="8"/>
+        </w:tblBorders>
+      </w:tblPr>
+      <w:tblGrid>
+        <w:gridCol w:w="7100"/>
+        <w:gridCol w:w="2260"/>
+      </w:tblGrid>
+      <w:tr>
+        <w:tc>
+          <w:tcPr>
+            <w:tcW w:type="dxa" w:w="7100"/>
+            <w:shd w:fill="10243A" w:val="clear"/>
+            <w:tcMar>
+              <w:top w:type="dxa" w:w="100"/>
+              <w:left w:type="dxa" w:w="170"/>
+              <w:bottom w:type="dxa" w:w="100"/>
+              <w:right w:type="dxa" w:w="150"/>
+            </w:tcMar>
+          </w:tcPr>
+          <w:p>
+            <w:r>
+              <w:rPr>
+                <w:b/>
+                <w:bCs/>
+                <w:color w:val="FFFFFF"/>
+                <w:sz w:val="17"/>
+                <w:szCs w:val="17"/>
+                <w:spacing w:val="30"/>
+              </w:rPr>
+              <w:t xml:space="preserve">PART 6</w:t>
+            </w:r>
+            <w:r>
+              <w:rPr>
+                <w:b/>
+                <w:bCs/>
+                <w:color w:val="FFFFFF"/>
+                <w:sz w:val="17"/>
+                <w:szCs w:val="17"/>
+                <w:spacing w:val="20"/>
+              </w:rPr>
+              <w:t xml:space="preserve">    THE TURN — PAGE TWO</w:t>
+            </w:r>
+          </w:p>
+        </w:tc>
+        <w:tc>
+          <w:tcPr>
+            <w:tcW w:type="dxa" w:w="2260"/>
+            <w:shd w:fill="10243A" w:val="clear"/>
+            <w:tcMar>
+              <w:top w:type="dxa" w:w="100"/>
+              <w:left w:type="dxa" w:w="150"/>
+              <w:bottom w:type="dxa" w:w="100"/>
+              <w:right w:type="dxa" w:w="170"/>
+            </w:tcMar>
+          </w:tcPr>
+          <w:p>
+            <w:pPr>
+              <w:jc w:val="right"/>
+            </w:pPr>
+            <w:r>
+              <w:rPr>
+                <w:b/>
+                <w:bCs/>
+                <w:color w:val="FFFFFF"/>
+                <w:sz w:val="17"/>
+                <w:szCs w:val="17"/>
+                <w:spacing w:val="20"/>
+              </w:rPr>
+              <w:t xml:space="preserve">MIN 72</w:t>
+            </w:r>
+          </w:p>
+        </w:tc>
+      </w:tr>
+    </w:tbl>
+    <w:tbl>
+      <w:tblPr>
+        <w:tblW w:type="dxa" w:w="9360"/>
+        <w:tblBorders>
+          <w:top w:val="single" w:color="10243A" w:sz="8"/>
+          <w:left w:val="single" w:color="10243A" w:sz="8"/>
+          <w:bottom w:val="single" w:color="10243A" w:sz="8"/>
+          <w:right w:val="single" w:color="10243A" w:sz="8"/>
+          <w:insideH w:val="single" w:color="10243A" w:sz="8"/>
+          <w:insideV w:val="single" w:color="10243A" w:sz="8"/>
+        </w:tblBorders>
+      </w:tblPr>
+      <w:tblGrid>
+        <w:gridCol w:w="9360"/>
+      </w:tblGrid>
+      <w:tr>
+        <w:tc>
+          <w:tcPr>
+            <w:tcW w:type="dxa" w:w="9360"/>
+            <w:shd w:fill="F2F5F8" w:val="clear"/>
+            <w:tcMar>
+              <w:top w:type="dxa" w:w="110"/>
+              <w:left w:type="dxa" w:w="170"/>
+              <w:bottom w:type="dxa" w:w="110"/>
+              <w:right w:type="dxa" w:w="170"/>
+            </w:tcMar>
+          </w:tcPr>
+          <w:p>
+            <w:pPr>
+              <w:spacing w:after="0" w:line="275"/>
+            </w:pPr>
+            <w:r>
+              <w:rPr>
+                <w:b/>
+                <w:bCs/>
+                <w:color w:val="10243A"/>
+                <w:sz w:val="15"/>
+                <w:szCs w:val="15"/>
+                <w:spacing w:val="20"/>
+              </w:rPr>
+              <w:t xml:space="preserve">CUE   </w:t>
+            </w:r>
+            <w:r>
+              <w:rPr>
+                <w:i/>
+                <w:iCs/>
+                <w:color w:val="5F6B79"/>
+                <w:sz w:val="19"/>
+                <w:szCs w:val="19"/>
+              </w:rPr>
+              <w:t xml:space="preserve">Stop the room. This is the real assignment and most of them think they are nearly done.</w:t>
+            </w:r>
+          </w:p>
+        </w:tc>
+      </w:tr>
+      <w:tr>
+        <w:tc>
+          <w:tcPr>
+            <w:tcW w:type="dxa" w:w="9360"/>
+            <w:tcMar>
+              <w:top w:type="dxa" w:w="170"/>
+              <w:left w:type="dxa" w:w="200"/>
+              <w:bottom w:type="dxa" w:w="150"/>
+              <w:right w:type="dxa" w:w="200"/>
+            </w:tcMar>
+          </w:tcPr>
+          <w:p>
+            <w:pPr>
+              <w:spacing w:after="130" w:line="320"/>
+            </w:pPr>
+            <w:r>
+              <w:rPr>
+                <w:color w:val="1B1B1B"/>
+                <w:sz w:val="23"/>
+                <w:szCs w:val="23"/>
+              </w:rPr>
+              <w:t xml:space="preserve">Hands up off the keyboards. Go to page two.</w:t>
+            </w:r>
+          </w:p>
+          <w:p>
+            <w:pPr>
+              <w:spacing w:after="130" w:line="320"/>
+            </w:pPr>
+            <w:r>
+              <w:rPr>
+                <w:color w:val="1B1B1B"/>
+                <w:sz w:val="23"/>
+                <w:szCs w:val="23"/>
+              </w:rPr>
+              <w:t xml:space="preserve">Look at every blank you left. Every one of those is a question somebody has to answer before this case goes anywhere at all.</w:t>
+            </w:r>
+          </w:p>
+          <w:p>
+            <w:pPr>
+              <w:spacing w:after="130" w:line="320"/>
+            </w:pPr>
+            <w:r>
+              <w:rPr>
+                <w:color w:val="1B1B1B"/>
+                <w:sz w:val="23"/>
+                <w:szCs w:val="23"/>
+              </w:rPr>
+              <w:t xml:space="preserve">Three columns. What you could not establish. Who would know it. How you would get it.</w:t>
+            </w:r>
+          </w:p>
+          <w:p>
+            <w:pPr>
+              <w:spacing w:after="130" w:line="320"/>
+            </w:pPr>
+            <w:r>
+              <w:rPr>
+                <w:color w:val="1B1B1B"/>
+                <w:sz w:val="23"/>
+                <w:szCs w:val="23"/>
+              </w:rPr>
+              <w:t xml:space="preserve">This page is worth as much as the report. An officer who knows what is missing is doing the job. An officer who filled the blanks in with guesses just lost the case.</w:t>
+            </w:r>
+          </w:p>
+        </w:tc>
+      </w:tr>
+    </w:tbl>
+    <w:p>
+      <w:pPr>
+        <w:spacing w:after="230" w:line="276"/>
+      </w:pPr>
+      <w:r>
+        <w:rPr>
+          <w:color w:val="1B1B1B"/>
+          <w:sz w:val="21"/>
+          <w:szCs w:val="21"/>
+        </w:rPr>
+        <w:t xml:space="preserve"/>
+      </w:r>
+    </w:p>
+    <w:tbl>
+      <w:tblPr>
+        <w:tblW w:type="dxa" w:w="9360"/>
+        <w:tblBorders>
+          <w:top w:val="single" w:color="10243A" w:sz="8"/>
+          <w:left w:val="single" w:color="10243A" w:sz="8"/>
+          <w:bottom w:val="single" w:color="10243A" w:sz="8"/>
+          <w:right w:val="single" w:color="10243A" w:sz="8"/>
+          <w:insideH w:val="single" w:color="10243A" w:sz="8"/>
+          <w:insideV w:val="single" w:color="10243A" w:sz="8"/>
+        </w:tblBorders>
+      </w:tblPr>
+      <w:tblGrid>
+        <w:gridCol w:w="7100"/>
+        <w:gridCol w:w="2260"/>
+      </w:tblGrid>
+      <w:tr>
+        <w:tc>
+          <w:tcPr>
+            <w:tcW w:type="dxa" w:w="7100"/>
+            <w:shd w:fill="10243A" w:val="clear"/>
+            <w:tcMar>
+              <w:top w:type="dxa" w:w="100"/>
+              <w:left w:type="dxa" w:w="170"/>
+              <w:bottom w:type="dxa" w:w="100"/>
+              <w:right w:type="dxa" w:w="150"/>
+            </w:tcMar>
+          </w:tcPr>
+          <w:p>
+            <w:r>
+              <w:rPr>
+                <w:b/>
+                <w:bCs/>
+                <w:color w:val="FFFFFF"/>
+                <w:sz w:val="17"/>
+                <w:szCs w:val="17"/>
+                <w:spacing w:val="30"/>
+              </w:rPr>
+              <w:t xml:space="preserve">PART 7</w:t>
+            </w:r>
+            <w:r>
+              <w:rPr>
+                <w:b/>
+                <w:bCs/>
+                <w:color w:val="FFFFFF"/>
+                <w:sz w:val="17"/>
+                <w:szCs w:val="17"/>
+                <w:spacing w:val="20"/>
+              </w:rPr>
+              <w:t xml:space="preserve">    THE CLOSE</w:t>
+            </w:r>
+          </w:p>
+        </w:tc>
+        <w:tc>
+          <w:tcPr>
+            <w:tcW w:type="dxa" w:w="2260"/>
+            <w:shd w:fill="10243A" w:val="clear"/>
+            <w:tcMar>
+              <w:top w:type="dxa" w:w="100"/>
+              <w:left w:type="dxa" w:w="150"/>
+              <w:bottom w:type="dxa" w:w="100"/>
+              <w:right w:type="dxa" w:w="170"/>
+            </w:tcMar>
+          </w:tcPr>
+          <w:p>
+            <w:pPr>
+              <w:jc w:val="right"/>
+            </w:pPr>
+            <w:r>
+              <w:rPr>
+                <w:b/>
+                <w:bCs/>
+                <w:color w:val="FFFFFF"/>
+                <w:sz w:val="17"/>
+                <w:szCs w:val="17"/>
+                <w:spacing w:val="20"/>
+              </w:rPr>
+              <w:t xml:space="preserve">MIN 84–90</w:t>
+            </w:r>
+          </w:p>
+        </w:tc>
+      </w:tr>
+    </w:tbl>
+    <w:tbl>
+      <w:tblPr>
+        <w:tblW w:type="dxa" w:w="9360"/>
+        <w:tblBorders>
+          <w:top w:val="single" w:color="10243A" w:sz="8"/>
+          <w:left w:val="single" w:color="10243A" w:sz="8"/>
+          <w:bottom w:val="single" w:color="10243A" w:sz="8"/>
+          <w:right w:val="single" w:color="10243A" w:sz="8"/>
+          <w:insideH w:val="single" w:color="10243A" w:sz="8"/>
+          <w:insideV w:val="single" w:color="10243A" w:sz="8"/>
+        </w:tblBorders>
+      </w:tblPr>
+      <w:tblGrid>
+        <w:gridCol w:w="9360"/>
+      </w:tblGrid>
+      <w:tr>
+        <w:tc>
+          <w:tcPr>
+            <w:tcW w:type="dxa" w:w="9360"/>
+            <w:shd w:fill="F2F5F8" w:val="clear"/>
+            <w:tcMar>
+              <w:top w:type="dxa" w:w="110"/>
+              <w:left w:type="dxa" w:w="170"/>
+              <w:bottom w:type="dxa" w:w="110"/>
+              <w:right w:type="dxa" w:w="170"/>
+            </w:tcMar>
+          </w:tcPr>
+          <w:p>
+            <w:pPr>
+              <w:spacing w:after="0" w:line="275"/>
+            </w:pPr>
+            <w:r>
+              <w:rPr>
+                <w:b/>
+                <w:bCs/>
+                <w:color w:val="10243A"/>
+                <w:sz w:val="15"/>
+                <w:szCs w:val="15"/>
+                <w:spacing w:val="20"/>
+              </w:rPr>
+              <w:t xml:space="preserve">CUE   </w:t>
+            </w:r>
+            <w:r>
+              <w:rPr>
+                <w:i/>
+                <w:iCs/>
+                <w:color w:val="5F6B79"/>
+                <w:sz w:val="19"/>
+                <w:szCs w:val="19"/>
+              </w:rPr>
+              <w:t xml:space="preserve">Collect gaps out loud and write them on the board. Leave them up if you can.</w:t>
+            </w:r>
+          </w:p>
+        </w:tc>
+      </w:tr>
+      <w:tr>
+        <w:tc>
+          <w:tcPr>
+            <w:tcW w:type="dxa" w:w="9360"/>
+            <w:tcMar>
+              <w:top w:type="dxa" w:w="170"/>
+              <w:left w:type="dxa" w:w="200"/>
+              <w:bottom w:type="dxa" w:w="150"/>
+              <w:right w:type="dxa" w:w="200"/>
+            </w:tcMar>
+          </w:tcPr>
+          <w:p>
+            <w:pPr>
+              <w:spacing w:after="130" w:line="320"/>
+            </w:pPr>
+            <w:r>
+              <w:rPr>
+                <w:color w:val="1B1B1B"/>
+                <w:sz w:val="23"/>
+                <w:szCs w:val="23"/>
+              </w:rPr>
+              <w:t xml:space="preserve">Four people, one gap each, out loud.</w:t>
+            </w:r>
+          </w:p>
+          <w:p>
+            <w:pPr>
+              <w:spacing w:before="60" w:after="110" w:line="280"/>
+              <w:ind w:left="300"/>
+            </w:pPr>
+            <w:r>
+              <w:rPr>
+                <w:i/>
+                <w:iCs/>
+                <w:color w:val="5F6B79"/>
+                <w:sz w:val="19"/>
+                <w:szCs w:val="19"/>
+              </w:rPr>
+              <w:t xml:space="preserve">Write each one on the board as they say it.</w:t>
+            </w:r>
+          </w:p>
+          <w:p>
+            <w:pPr>
+              <w:spacing w:after="130" w:line="320"/>
+            </w:pPr>
+            <w:r>
+              <w:rPr>
+                <w:color w:val="1B1B1B"/>
+                <w:sz w:val="23"/>
+                <w:szCs w:val="23"/>
+              </w:rPr>
+              <w:t xml:space="preserve">Look at that list. Thursday you get an interview — the operations supervisor, Ray’s boss. She can answer some of this.</w:t>
+            </w:r>
+          </w:p>
+          <w:p>
+            <w:pPr>
+              <w:spacing w:after="130" w:line="320"/>
+            </w:pPr>
+            <w:r>
+              <w:rPr>
+                <w:color w:val="1B1B1B"/>
+                <w:sz w:val="23"/>
+                <w:szCs w:val="23"/>
+              </w:rPr>
+              <w:t xml:space="preserve">But you only get answers to the questions you actually write down. So bring that page.</w:t>
+            </w:r>
+          </w:p>
+        </w:tc>
+      </w:tr>
+    </w:tbl>
+    <w:p>
+      <w:pPr>
+        <w:spacing w:after="230" w:line="276"/>
+      </w:pPr>
+      <w:r>
+        <w:rPr>
+          <w:color w:val="1B1B1B"/>
+          <w:sz w:val="21"/>
+          <w:szCs w:val="21"/>
+        </w:rPr>
+        <w:t xml:space="preserve"/>
+      </w:r>
+    </w:p>
+    <w:p>
+      <w:r>
+        <w:br w:type="page"/>
+      </w:r>
+    </w:p>
+    <w:p>
+      <w:pPr>
+        <w:spacing w:after="40"/>
+      </w:pPr>
+      <w:r>
+        <w:rPr>
+          <w:b/>
+          <w:bCs/>
+          <w:color w:val="1A5FB4"/>
+          <w:sz w:val="17"/>
+          <w:szCs w:val="17"/>
+          <w:spacing w:val="30"/>
+        </w:rPr>
+        <w:t xml:space="preserve">DAY 2 · YOUR PARTS</w:t>
+      </w:r>
+    </w:p>
+    <w:p>
+      <w:pPr>
+        <w:spacing w:after="110" w:line="276"/>
+      </w:pPr>
+      <w:r>
+        <w:rPr>
+          <w:color w:val="1B1B1B"/>
+          <w:sz w:val="21"/>
+          <w:szCs w:val="21"/>
+        </w:rPr>
+        <w:t xml:space="preserve"/>
+      </w:r>
+    </w:p>
+    <w:tbl>
+      <w:tblPr>
+        <w:tblW w:type="dxa" w:w="9360"/>
+        <w:tblBorders>
+          <w:top w:val="single" w:color="10243A" w:sz="8"/>
+          <w:left w:val="single" w:color="10243A" w:sz="8"/>
+          <w:bottom w:val="single" w:color="10243A" w:sz="8"/>
+          <w:right w:val="single" w:color="10243A" w:sz="8"/>
+          <w:insideH w:val="single" w:color="10243A" w:sz="8"/>
+          <w:insideV w:val="single" w:color="10243A" w:sz="8"/>
+        </w:tblBorders>
+      </w:tblPr>
+      <w:tblGrid>
+        <w:gridCol w:w="7100"/>
+        <w:gridCol w:w="2260"/>
+      </w:tblGrid>
+      <w:tr>
+        <w:tc>
+          <w:tcPr>
+            <w:tcW w:type="dxa" w:w="7100"/>
+            <w:shd w:fill="10243A" w:val="clear"/>
+            <w:tcMar>
+              <w:top w:type="dxa" w:w="100"/>
+              <w:left w:type="dxa" w:w="170"/>
+              <w:bottom w:type="dxa" w:w="100"/>
+              <w:right w:type="dxa" w:w="150"/>
+            </w:tcMar>
+          </w:tcPr>
+          <w:p>
+            <w:r>
+              <w:rPr>
+                <w:b/>
+                <w:bCs/>
+                <w:color w:val="FFFFFF"/>
+                <w:sz w:val="17"/>
+                <w:szCs w:val="17"/>
+                <w:spacing w:val="30"/>
+              </w:rPr>
+              <w:t xml:space="preserve">PART 8</w:t>
+            </w:r>
+            <w:r>
+              <w:rPr>
+                <w:b/>
+                <w:bCs/>
+                <w:color w:val="FFFFFF"/>
+                <w:sz w:val="17"/>
+                <w:szCs w:val="17"/>
+                <w:spacing w:val="20"/>
+              </w:rPr>
+              <w:t xml:space="preserve">    THE INTRO</w:t>
+            </w:r>
+          </w:p>
+        </w:tc>
+        <w:tc>
+          <w:tcPr>
+            <w:tcW w:type="dxa" w:w="2260"/>
+            <w:shd w:fill="10243A" w:val="clear"/>
+            <w:tcMar>
+              <w:top w:type="dxa" w:w="100"/>
+              <w:left w:type="dxa" w:w="150"/>
+              <w:bottom w:type="dxa" w:w="100"/>
+              <w:right w:type="dxa" w:w="170"/>
+            </w:tcMar>
+          </w:tcPr>
+          <w:p>
+            <w:pPr>
+              <w:jc w:val="right"/>
+            </w:pPr>
+            <w:r>
+              <w:rPr>
+                <w:b/>
+                <w:bCs/>
+                <w:color w:val="FFFFFF"/>
+                <w:sz w:val="17"/>
+                <w:szCs w:val="17"/>
+                <w:spacing w:val="20"/>
+              </w:rPr>
+              <w:t xml:space="preserve">MIN 0–8</w:t>
+            </w:r>
+          </w:p>
+        </w:tc>
+      </w:tr>
+    </w:tbl>
+    <w:tbl>
+      <w:tblPr>
+        <w:tblW w:type="dxa" w:w="9360"/>
+        <w:tblBorders>
+          <w:top w:val="single" w:color="10243A" w:sz="8"/>
+          <w:left w:val="single" w:color="10243A" w:sz="8"/>
+          <w:bottom w:val="single" w:color="10243A" w:sz="8"/>
+          <w:right w:val="single" w:color="10243A" w:sz="8"/>
+          <w:insideH w:val="single" w:color="10243A" w:sz="8"/>
+          <w:insideV w:val="single" w:color="10243A" w:sz="8"/>
+        </w:tblBorders>
+      </w:tblPr>
+      <w:tblGrid>
+        <w:gridCol w:w="9360"/>
+      </w:tblGrid>
+      <w:tr>
+        <w:tc>
+          <w:tcPr>
+            <w:tcW w:type="dxa" w:w="9360"/>
+            <w:shd w:fill="F2F5F8" w:val="clear"/>
+            <w:tcMar>
+              <w:top w:type="dxa" w:w="110"/>
+              <w:left w:type="dxa" w:w="170"/>
+              <w:bottom w:type="dxa" w:w="110"/>
+              <w:right w:type="dxa" w:w="170"/>
+            </w:tcMar>
+          </w:tcPr>
+          <w:p>
+            <w:pPr>
+              <w:spacing w:after="0" w:line="275"/>
+            </w:pPr>
+            <w:r>
+              <w:rPr>
+                <w:b/>
+                <w:bCs/>
+                <w:color w:val="10243A"/>
+                <w:sz w:val="15"/>
+                <w:szCs w:val="15"/>
+                <w:spacing w:val="20"/>
+              </w:rPr>
+              <w:t xml:space="preserve">CUE   </w:t>
+            </w:r>
+            <w:r>
+              <w:rPr>
+                <w:i/>
+                <w:iCs/>
+                <w:color w:val="5F6B79"/>
+                <w:sz w:val="19"/>
+                <w:szCs w:val="19"/>
+              </w:rPr>
+              <w:t xml:space="preserve">Do-now. They reopen Tuesday’s page two.</w:t>
+            </w:r>
+          </w:p>
+        </w:tc>
+      </w:tr>
+      <w:tr>
+        <w:tc>
+          <w:tcPr>
+            <w:tcW w:type="dxa" w:w="9360"/>
+            <w:tcMar>
+              <w:top w:type="dxa" w:w="170"/>
+              <w:left w:type="dxa" w:w="200"/>
+              <w:bottom w:type="dxa" w:w="150"/>
+              <w:right w:type="dxa" w:w="200"/>
+            </w:tcMar>
+          </w:tcPr>
+          <w:p>
+            <w:pPr>
+              <w:spacing w:after="130" w:line="320"/>
+            </w:pPr>
+            <w:r>
+              <w:rPr>
+                <w:color w:val="1B1B1B"/>
+                <w:sz w:val="23"/>
+                <w:szCs w:val="23"/>
+              </w:rPr>
+              <w:t xml:space="preserve">Pull up page two from Tuesday. Circle your three worst holes — the three things that bother you most about your own report.</w:t>
+            </w:r>
+          </w:p>
+          <w:p>
+            <w:pPr>
+              <w:spacing w:after="130" w:line="320"/>
+            </w:pPr>
+            <w:r>
+              <w:rPr>
+                <w:color w:val="1B1B1B"/>
+                <w:sz w:val="23"/>
+                <w:szCs w:val="23"/>
+              </w:rPr>
+              <w:t xml:space="preserve">Those three are what today is for. You get one interview. Marisa Vance, operations supervisor. Ray’s boss.</w:t>
+            </w:r>
+          </w:p>
+          <w:p>
+            <w:pPr>
+              <w:spacing w:after="130" w:line="320"/>
+            </w:pPr>
+            <w:r>
+              <w:rPr>
+                <w:color w:val="1B1B1B"/>
+                <w:sz w:val="23"/>
+                <w:szCs w:val="23"/>
+              </w:rPr>
+              <w:t xml:space="preserve">One interview. That is it. No second go, no follow-up call.</w:t>
+            </w:r>
+          </w:p>
+        </w:tc>
+      </w:tr>
+    </w:tbl>
+    <w:p>
+      <w:pPr>
+        <w:spacing w:after="230" w:line="276"/>
+      </w:pPr>
+      <w:r>
+        <w:rPr>
+          <w:color w:val="1B1B1B"/>
+          <w:sz w:val="21"/>
+          <w:szCs w:val="21"/>
+        </w:rPr>
+        <w:t xml:space="preserve"/>
+      </w:r>
+    </w:p>
+    <w:tbl>
+      <w:tblPr>
+        <w:tblW w:type="dxa" w:w="9360"/>
+        <w:tblBorders>
+          <w:top w:val="single" w:color="10243A" w:sz="8"/>
+          <w:left w:val="single" w:color="10243A" w:sz="8"/>
+          <w:bottom w:val="single" w:color="10243A" w:sz="8"/>
+          <w:right w:val="single" w:color="10243A" w:sz="8"/>
+          <w:insideH w:val="single" w:color="10243A" w:sz="8"/>
+          <w:insideV w:val="single" w:color="10243A" w:sz="8"/>
+        </w:tblBorders>
+      </w:tblPr>
+      <w:tblGrid>
+        <w:gridCol w:w="7100"/>
+        <w:gridCol w:w="2260"/>
+      </w:tblGrid>
+      <w:tr>
+        <w:tc>
+          <w:tcPr>
+            <w:tcW w:type="dxa" w:w="7100"/>
+            <w:shd w:fill="10243A" w:val="clear"/>
+            <w:tcMar>
+              <w:top w:type="dxa" w:w="100"/>
+              <w:left w:type="dxa" w:w="170"/>
+              <w:bottom w:type="dxa" w:w="100"/>
+              <w:right w:type="dxa" w:w="150"/>
+            </w:tcMar>
+          </w:tcPr>
+          <w:p>
+            <w:r>
+              <w:rPr>
+                <w:b/>
+                <w:bCs/>
+                <w:color w:val="FFFFFF"/>
+                <w:sz w:val="17"/>
+                <w:szCs w:val="17"/>
+                <w:spacing w:val="30"/>
+              </w:rPr>
+              <w:t xml:space="preserve">PART 9</w:t>
+            </w:r>
+            <w:r>
+              <w:rPr>
+                <w:b/>
+                <w:bCs/>
+                <w:color w:val="FFFFFF"/>
+                <w:sz w:val="17"/>
+                <w:szCs w:val="17"/>
+                <w:spacing w:val="20"/>
+              </w:rPr>
+              <w:t xml:space="preserve">    HOW TO ASK</w:t>
+            </w:r>
+          </w:p>
+        </w:tc>
+        <w:tc>
+          <w:tcPr>
+            <w:tcW w:type="dxa" w:w="2260"/>
+            <w:shd w:fill="10243A" w:val="clear"/>
+            <w:tcMar>
+              <w:top w:type="dxa" w:w="100"/>
+              <w:left w:type="dxa" w:w="150"/>
+              <w:bottom w:type="dxa" w:w="100"/>
+              <w:right w:type="dxa" w:w="170"/>
+            </w:tcMar>
+          </w:tcPr>
+          <w:p>
+            <w:pPr>
+              <w:jc w:val="right"/>
+            </w:pPr>
+            <w:r>
+              <w:rPr>
+                <w:b/>
+                <w:bCs/>
+                <w:color w:val="FFFFFF"/>
+                <w:sz w:val="17"/>
+                <w:szCs w:val="17"/>
+                <w:spacing w:val="20"/>
+              </w:rPr>
+              <w:t xml:space="preserve">MIN 8–18</w:t>
+            </w:r>
+          </w:p>
+        </w:tc>
+      </w:tr>
+    </w:tbl>
+    <w:tbl>
+      <w:tblPr>
+        <w:tblW w:type="dxa" w:w="9360"/>
+        <w:tblBorders>
+          <w:top w:val="single" w:color="10243A" w:sz="8"/>
+          <w:left w:val="single" w:color="10243A" w:sz="8"/>
+          <w:bottom w:val="single" w:color="10243A" w:sz="8"/>
+          <w:right w:val="single" w:color="10243A" w:sz="8"/>
+          <w:insideH w:val="single" w:color="10243A" w:sz="8"/>
+          <w:insideV w:val="single" w:color="10243A" w:sz="8"/>
+        </w:tblBorders>
+      </w:tblPr>
+      <w:tblGrid>
+        <w:gridCol w:w="9360"/>
+      </w:tblGrid>
+      <w:tr>
+        <w:tc>
+          <w:tcPr>
+            <w:tcW w:type="dxa" w:w="9360"/>
+            <w:shd w:fill="F2F5F8" w:val="clear"/>
+            <w:tcMar>
+              <w:top w:type="dxa" w:w="110"/>
+              <w:left w:type="dxa" w:w="170"/>
+              <w:bottom w:type="dxa" w:w="110"/>
+              <w:right w:type="dxa" w:w="170"/>
+            </w:tcMar>
+          </w:tcPr>
+          <w:p>
+            <w:pPr>
+              <w:spacing w:after="0" w:line="275"/>
+            </w:pPr>
+            <w:r>
+              <w:rPr>
+                <w:b/>
+                <w:bCs/>
+                <w:color w:val="10243A"/>
+                <w:sz w:val="15"/>
+                <w:szCs w:val="15"/>
+                <w:spacing w:val="20"/>
+              </w:rPr>
+              <w:t xml:space="preserve">CUE   </w:t>
+            </w:r>
+            <w:r>
+              <w:rPr>
+                <w:i/>
+                <w:iCs/>
+                <w:color w:val="5F6B79"/>
+                <w:sz w:val="19"/>
+                <w:szCs w:val="19"/>
+              </w:rPr>
+              <w:t xml:space="preserve">Mini-lesson off the five rules on file 3. Do the door example on the board.</w:t>
+            </w:r>
+          </w:p>
+        </w:tc>
+      </w:tr>
+      <w:tr>
+        <w:tc>
+          <w:tcPr>
+            <w:tcW w:type="dxa" w:w="9360"/>
+            <w:tcMar>
+              <w:top w:type="dxa" w:w="170"/>
+              <w:left w:type="dxa" w:w="200"/>
+              <w:bottom w:type="dxa" w:w="150"/>
+              <w:right w:type="dxa" w:w="200"/>
+            </w:tcMar>
+          </w:tcPr>
+          <w:p>
+            <w:pPr>
+              <w:spacing w:after="130" w:line="320"/>
+            </w:pPr>
+            <w:r>
+              <w:rPr>
+                <w:color w:val="1B1B1B"/>
+                <w:sz w:val="23"/>
+                <w:szCs w:val="23"/>
+              </w:rPr>
+              <w:t xml:space="preserve">Before you talk to her you have to know how to ask. Four things.</w:t>
+            </w:r>
+          </w:p>
+          <w:p>
+            <w:pPr>
+              <w:spacing w:after="130" w:line="320"/>
+            </w:pPr>
+            <w:r>
+              <w:rPr>
+                <w:color w:val="1B1B1B"/>
+                <w:sz w:val="23"/>
+                <w:szCs w:val="23"/>
+              </w:rPr>
+              <w:t xml:space="preserve">First. Open, not closed. Watch — “Was the door forced open?” What do I get? Yes or no. Now — “Describe the door.” What do I get? A paragraph. Same information. One question actually gets it.</w:t>
+            </w:r>
+          </w:p>
+          <w:p>
+            <w:pPr>
+              <w:spacing w:after="130" w:line="320"/>
+            </w:pPr>
+            <w:r>
+              <w:rPr>
+                <w:color w:val="1B1B1B"/>
+                <w:sz w:val="23"/>
+                <w:szCs w:val="23"/>
+              </w:rPr>
+              <w:t xml:space="preserve">Second. One fact per question. Ask two things at once and you get one answer, and you will not know which one she answered.</w:t>
+            </w:r>
+          </w:p>
+          <w:p>
+            <w:pPr>
+              <w:spacing w:after="130" w:line="320"/>
+            </w:pPr>
+            <w:r>
+              <w:rPr>
+                <w:color w:val="1B1B1B"/>
+                <w:sz w:val="23"/>
+                <w:szCs w:val="23"/>
+              </w:rPr>
+              <w:t xml:space="preserve">Third, and this is the big one. Never put the answer in the question. If I say “there were about ten laptops in there, right?” — she can just agree with me. And now there is a number in my report that I made up myself. I did not learn anything. I contaminated my own case.</w:t>
+            </w:r>
+          </w:p>
+          <w:p>
+            <w:pPr>
+              <w:spacing w:after="130" w:line="320"/>
+            </w:pPr>
+            <w:r>
+              <w:rPr>
+                <w:color w:val="1B1B1B"/>
+                <w:sz w:val="23"/>
+                <w:szCs w:val="23"/>
+              </w:rPr>
+              <w:t xml:space="preserve">Fourth. Always ask how she knows. Every fact in your report needs a source. “Vance stated she counted them Friday afternoon” is evidence. “There were nine laptops” is just a sentence.</w:t>
+            </w:r>
+          </w:p>
+        </w:tc>
+      </w:tr>
+    </w:tbl>
+    <w:p>
+      <w:pPr>
+        <w:spacing w:after="230" w:line="276"/>
+      </w:pPr>
+      <w:r>
+        <w:rPr>
+          <w:color w:val="1B1B1B"/>
+          <w:sz w:val="21"/>
+          <w:szCs w:val="21"/>
+        </w:rPr>
+        <w:t xml:space="preserve"/>
+      </w:r>
+    </w:p>
+    <w:tbl>
+      <w:tblPr>
+        <w:tblW w:type="dxa" w:w="9360"/>
+        <w:tblBorders>
+          <w:top w:val="single" w:color="9A3412" w:sz="8"/>
+          <w:left w:val="single" w:color="9A3412" w:sz="8"/>
+          <w:bottom w:val="single" w:color="9A3412" w:sz="8"/>
+          <w:right w:val="single" w:color="9A3412" w:sz="8"/>
+          <w:insideH w:val="single" w:color="9A3412" w:sz="8"/>
+          <w:insideV w:val="single" w:color="9A3412" w:sz="8"/>
+        </w:tblBorders>
+      </w:tblPr>
+      <w:tblGrid>
+        <w:gridCol w:w="7100"/>
+        <w:gridCol w:w="2260"/>
+      </w:tblGrid>
+      <w:tr>
+        <w:tc>
+          <w:tcPr>
+            <w:tcW w:type="dxa" w:w="7100"/>
+            <w:shd w:fill="9A3412" w:val="clear"/>
+            <w:tcMar>
+              <w:top w:type="dxa" w:w="100"/>
+              <w:left w:type="dxa" w:w="170"/>
+              <w:bottom w:type="dxa" w:w="100"/>
+              <w:right w:type="dxa" w:w="150"/>
+            </w:tcMar>
+          </w:tcPr>
+          <w:p>
+            <w:r>
+              <w:rPr>
+                <w:b/>
+                <w:bCs/>
+                <w:color w:val="FFFFFF"/>
+                <w:sz w:val="17"/>
+                <w:szCs w:val="17"/>
+                <w:spacing w:val="30"/>
+              </w:rPr>
+              <w:t xml:space="preserve">PART 10</w:t>
+            </w:r>
+            <w:r>
+              <w:rPr>
+                <w:b/>
+                <w:bCs/>
+                <w:color w:val="FFFFFF"/>
+                <w:sz w:val="17"/>
+                <w:szCs w:val="17"/>
+                <w:spacing w:val="20"/>
+              </w:rPr>
+              <w:t xml:space="preserve">    SEND-OFF — ASSIGNMENT 2A</w:t>
+            </w:r>
+          </w:p>
+        </w:tc>
+        <w:tc>
+          <w:tcPr>
+            <w:tcW w:type="dxa" w:w="2260"/>
+            <w:shd w:fill="9A3412" w:val="clear"/>
+            <w:tcMar>
+              <w:top w:type="dxa" w:w="100"/>
+              <w:left w:type="dxa" w:w="150"/>
+              <w:bottom w:type="dxa" w:w="100"/>
+              <w:right w:type="dxa" w:w="170"/>
+            </w:tcMar>
+          </w:tcPr>
+          <w:p>
+            <w:pPr>
+              <w:jc w:val="right"/>
+            </w:pPr>
+            <w:r>
+              <w:rPr>
+                <w:b/>
+                <w:bCs/>
+                <w:color w:val="FFFFFF"/>
+                <w:sz w:val="17"/>
+                <w:szCs w:val="17"/>
+                <w:spacing w:val="20"/>
+              </w:rPr>
+              <w:t xml:space="preserve">MIN 18</w:t>
+            </w:r>
+          </w:p>
+        </w:tc>
+      </w:tr>
+    </w:tbl>
+    <w:tbl>
+      <w:tblPr>
+        <w:tblW w:type="dxa" w:w="9360"/>
+        <w:tblBorders>
+          <w:top w:val="single" w:color="9A3412" w:sz="8"/>
+          <w:left w:val="single" w:color="9A3412" w:sz="8"/>
+          <w:bottom w:val="single" w:color="9A3412" w:sz="8"/>
+          <w:right w:val="single" w:color="9A3412" w:sz="8"/>
+          <w:insideH w:val="single" w:color="9A3412" w:sz="8"/>
+          <w:insideV w:val="single" w:color="9A3412" w:sz="8"/>
+        </w:tblBorders>
+      </w:tblPr>
+      <w:tblGrid>
+        <w:gridCol w:w="9360"/>
+      </w:tblGrid>
+      <w:tr>
+        <w:tc>
+          <w:tcPr>
+            <w:tcW w:type="dxa" w:w="9360"/>
+            <w:shd w:fill="FDF3EC" w:val="clear"/>
+            <w:tcMar>
+              <w:top w:type="dxa" w:w="110"/>
+              <w:left w:type="dxa" w:w="170"/>
+              <w:bottom w:type="dxa" w:w="110"/>
+              <w:right w:type="dxa" w:w="170"/>
+            </w:tcMar>
+          </w:tcPr>
+          <w:p>
+            <w:pPr>
+              <w:spacing w:after="0" w:line="275"/>
+            </w:pPr>
+            <w:r>
+              <w:rPr>
+                <w:b/>
+                <w:bCs/>
+                <w:color w:val="9A3412"/>
+                <w:sz w:val="15"/>
+                <w:szCs w:val="15"/>
+                <w:spacing w:val="20"/>
+              </w:rPr>
+              <w:t xml:space="preserve">CUE   </w:t>
+            </w:r>
+            <w:r>
+              <w:rPr>
+                <w:i/>
+                <w:iCs/>
+                <w:color w:val="5F6B79"/>
+                <w:sz w:val="19"/>
+                <w:szCs w:val="19"/>
+              </w:rPr>
+              <w:t xml:space="preserve">Interview Preparation. Fourteen minutes. They submit before anything else happens.</w:t>
+            </w:r>
+          </w:p>
+        </w:tc>
+      </w:tr>
+      <w:tr>
+        <w:tc>
+          <w:tcPr>
+            <w:tcW w:type="dxa" w:w="9360"/>
+            <w:tcMar>
+              <w:top w:type="dxa" w:w="170"/>
+              <w:left w:type="dxa" w:w="200"/>
+              <w:bottom w:type="dxa" w:w="150"/>
+              <w:right w:type="dxa" w:w="200"/>
+            </w:tcMar>
+          </w:tcPr>
+          <w:p>
+            <w:pPr>
+              <w:spacing w:after="130" w:line="320"/>
+            </w:pPr>
+            <w:r>
+              <w:rPr>
+                <w:color w:val="1B1B1B"/>
+                <w:sz w:val="23"/>
+                <w:szCs w:val="23"/>
+              </w:rPr>
+              <w:t xml:space="preserve">Interview Preparation is open in Canvas. Fourteen minutes.</w:t>
+            </w:r>
+          </w:p>
+          <w:p>
+            <w:pPr>
+              <w:spacing w:after="130" w:line="320"/>
+            </w:pPr>
+            <w:r>
+              <w:rPr>
+                <w:color w:val="1B1B1B"/>
+                <w:sz w:val="23"/>
+                <w:szCs w:val="23"/>
+              </w:rPr>
+              <w:t xml:space="preserve">Work down your gap list. For each hole, write the question. Write it out in full, the way you would actually say it to her.</w:t>
+            </w:r>
+          </w:p>
+          <w:p>
+            <w:pPr>
+              <w:spacing w:after="130" w:line="320"/>
+            </w:pPr>
+            <w:r>
+              <w:rPr>
+                <w:color w:val="1B1B1B"/>
+                <w:sz w:val="23"/>
+                <w:szCs w:val="23"/>
+              </w:rPr>
+              <w:t xml:space="preserve">Then submit it.</w:t>
+            </w:r>
+          </w:p>
+          <w:p>
+            <w:pPr>
+              <w:spacing w:after="130" w:line="320"/>
+            </w:pPr>
+            <w:r>
+              <w:rPr>
+                <w:color w:val="1B1B1B"/>
+                <w:sz w:val="23"/>
+                <w:szCs w:val="23"/>
+              </w:rPr>
+              <w:t xml:space="preserve">And here is the part you need to hear. You are not getting her statement until your questions are in. Weak questions, weak information. That is not me being awkward, that is the job.</w:t>
+            </w:r>
+          </w:p>
+          <w:p>
+            <w:pPr>
+              <w:spacing w:after="130" w:line="320"/>
+            </w:pPr>
+            <w:r>
+              <w:rPr>
+                <w:color w:val="1B1B1B"/>
+                <w:sz w:val="23"/>
+                <w:szCs w:val="23"/>
+              </w:rPr>
+              <w:t xml:space="preserve">Go.</w:t>
+            </w:r>
+          </w:p>
+        </w:tc>
+      </w:tr>
+    </w:tbl>
+    <w:p>
+      <w:pPr>
+        <w:spacing w:after="230" w:line="276"/>
+      </w:pPr>
+      <w:r>
+        <w:rPr>
+          <w:color w:val="1B1B1B"/>
+          <w:sz w:val="21"/>
+          <w:szCs w:val="21"/>
+        </w:rPr>
+        <w:t xml:space="preserve"/>
+      </w:r>
+    </w:p>
+    <w:tbl>
+      <w:tblPr>
+        <w:tblW w:type="dxa" w:w="9360"/>
+        <w:tblBorders>
+          <w:top w:val="single" w:color="10243A" w:sz="8"/>
+          <w:left w:val="single" w:color="10243A" w:sz="8"/>
+          <w:bottom w:val="single" w:color="10243A" w:sz="8"/>
+          <w:right w:val="single" w:color="10243A" w:sz="8"/>
+          <w:insideH w:val="single" w:color="10243A" w:sz="8"/>
+          <w:insideV w:val="single" w:color="10243A" w:sz="8"/>
+        </w:tblBorders>
+      </w:tblPr>
+      <w:tblGrid>
+        <w:gridCol w:w="7100"/>
+        <w:gridCol w:w="2260"/>
+      </w:tblGrid>
+      <w:tr>
+        <w:tc>
+          <w:tcPr>
+            <w:tcW w:type="dxa" w:w="7100"/>
+            <w:shd w:fill="10243A" w:val="clear"/>
+            <w:tcMar>
+              <w:top w:type="dxa" w:w="100"/>
+              <w:left w:type="dxa" w:w="170"/>
+              <w:bottom w:type="dxa" w:w="100"/>
+              <w:right w:type="dxa" w:w="150"/>
+            </w:tcMar>
+          </w:tcPr>
+          <w:p>
+            <w:r>
+              <w:rPr>
+                <w:b/>
+                <w:bCs/>
+                <w:color w:val="FFFFFF"/>
+                <w:sz w:val="17"/>
+                <w:szCs w:val="17"/>
+                <w:spacing w:val="30"/>
+              </w:rPr>
+              <w:t xml:space="preserve">PART 11</w:t>
+            </w:r>
+            <w:r>
+              <w:rPr>
+                <w:b/>
+                <w:bCs/>
+                <w:color w:val="FFFFFF"/>
+                <w:sz w:val="17"/>
+                <w:szCs w:val="17"/>
+                <w:spacing w:val="20"/>
+              </w:rPr>
+              <w:t xml:space="preserve">    THE GATE</w:t>
+            </w:r>
+          </w:p>
+        </w:tc>
+        <w:tc>
+          <w:tcPr>
+            <w:tcW w:type="dxa" w:w="2260"/>
+            <w:shd w:fill="10243A" w:val="clear"/>
+            <w:tcMar>
+              <w:top w:type="dxa" w:w="100"/>
+              <w:left w:type="dxa" w:w="150"/>
+              <w:bottom w:type="dxa" w:w="100"/>
+              <w:right w:type="dxa" w:w="170"/>
+            </w:tcMar>
+          </w:tcPr>
+          <w:p>
+            <w:pPr>
+              <w:jc w:val="right"/>
+            </w:pPr>
+            <w:r>
+              <w:rPr>
+                <w:b/>
+                <w:bCs/>
+                <w:color w:val="FFFFFF"/>
+                <w:sz w:val="17"/>
+                <w:szCs w:val="17"/>
+                <w:spacing w:val="20"/>
+              </w:rPr>
+              <w:t xml:space="preserve">MIN 32</w:t>
+            </w:r>
+          </w:p>
+        </w:tc>
+      </w:tr>
+    </w:tbl>
+    <w:tbl>
+      <w:tblPr>
+        <w:tblW w:type="dxa" w:w="9360"/>
+        <w:tblBorders>
+          <w:top w:val="single" w:color="10243A" w:sz="8"/>
+          <w:left w:val="single" w:color="10243A" w:sz="8"/>
+          <w:bottom w:val="single" w:color="10243A" w:sz="8"/>
+          <w:right w:val="single" w:color="10243A" w:sz="8"/>
+          <w:insideH w:val="single" w:color="10243A" w:sz="8"/>
+          <w:insideV w:val="single" w:color="10243A" w:sz="8"/>
+        </w:tblBorders>
+      </w:tblPr>
+      <w:tblGrid>
+        <w:gridCol w:w="9360"/>
+      </w:tblGrid>
+      <w:tr>
+        <w:tc>
+          <w:tcPr>
+            <w:tcW w:type="dxa" w:w="9360"/>
+            <w:shd w:fill="F2F5F8" w:val="clear"/>
+            <w:tcMar>
+              <w:top w:type="dxa" w:w="110"/>
+              <w:left w:type="dxa" w:w="170"/>
+              <w:bottom w:type="dxa" w:w="110"/>
+              <w:right w:type="dxa" w:w="170"/>
+            </w:tcMar>
+          </w:tcPr>
+          <w:p>
+            <w:pPr>
+              <w:spacing w:after="0" w:line="275"/>
+            </w:pPr>
+            <w:r>
+              <w:rPr>
+                <w:b/>
+                <w:bCs/>
+                <w:color w:val="10243A"/>
+                <w:sz w:val="15"/>
+                <w:szCs w:val="15"/>
+                <w:spacing w:val="20"/>
+              </w:rPr>
+              <w:t xml:space="preserve">CUE   </w:t>
+            </w:r>
+            <w:r>
+              <w:rPr>
+                <w:i/>
+                <w:iCs/>
+                <w:color w:val="5F6B79"/>
+                <w:sz w:val="19"/>
+                <w:szCs w:val="19"/>
+              </w:rPr>
+              <w:t xml:space="preserve">Hold this. Do not publish Assignment C until submissions are in. The whole lesson hangs here.</w:t>
+            </w:r>
+          </w:p>
+        </w:tc>
+      </w:tr>
+      <w:tr>
+        <w:tc>
+          <w:tcPr>
+            <w:tcW w:type="dxa" w:w="9360"/>
+            <w:tcMar>
+              <w:top w:type="dxa" w:w="170"/>
+              <w:left w:type="dxa" w:w="200"/>
+              <w:bottom w:type="dxa" w:w="150"/>
+              <w:right w:type="dxa" w:w="200"/>
+            </w:tcMar>
+          </w:tcPr>
+          <w:p>
+            <w:pPr>
+              <w:spacing w:after="130" w:line="320"/>
+            </w:pPr>
+            <w:r>
+              <w:rPr>
+                <w:color w:val="1B1B1B"/>
+                <w:sz w:val="23"/>
+                <w:szCs w:val="23"/>
+              </w:rPr>
+              <w:t xml:space="preserve">Pencils down. Submit. Everybody in?</w:t>
+            </w:r>
+          </w:p>
+          <w:p>
+            <w:pPr>
+              <w:spacing w:before="60" w:after="110" w:line="280"/>
+              <w:ind w:left="300"/>
+            </w:pPr>
+            <w:r>
+              <w:rPr>
+                <w:i/>
+                <w:iCs/>
+                <w:color w:val="5F6B79"/>
+                <w:sz w:val="19"/>
+                <w:szCs w:val="19"/>
+              </w:rPr>
+              <w:t xml:space="preserve">Check Canvas. Actually check. Then publish Assignment C and put file 4 on the board.</w:t>
+            </w:r>
+          </w:p>
+          <w:p>
+            <w:pPr>
+              <w:spacing w:after="130" w:line="320"/>
+            </w:pPr>
+            <w:r>
+              <w:rPr>
+                <w:color w:val="1B1B1B"/>
+                <w:sz w:val="23"/>
+                <w:szCs w:val="23"/>
+              </w:rPr>
+              <w:t xml:space="preserve">Okay. Here is what she said.</w:t>
+            </w:r>
+          </w:p>
+        </w:tc>
+      </w:tr>
+    </w:tbl>
+    <w:p>
+      <w:pPr>
+        <w:spacing w:after="230" w:line="276"/>
+      </w:pPr>
+      <w:r>
+        <w:rPr>
+          <w:color w:val="1B1B1B"/>
+          <w:sz w:val="21"/>
+          <w:szCs w:val="21"/>
+        </w:rPr>
+        <w:t xml:space="preserve"/>
+      </w:r>
+    </w:p>
+    <w:tbl>
+      <w:tblPr>
+        <w:tblW w:type="dxa" w:w="9360"/>
+        <w:tblBorders>
+          <w:top w:val="single" w:color="10243A" w:sz="8"/>
+          <w:left w:val="single" w:color="10243A" w:sz="8"/>
+          <w:bottom w:val="single" w:color="10243A" w:sz="8"/>
+          <w:right w:val="single" w:color="10243A" w:sz="8"/>
+          <w:insideH w:val="single" w:color="10243A" w:sz="8"/>
+          <w:insideV w:val="single" w:color="10243A" w:sz="8"/>
+        </w:tblBorders>
+      </w:tblPr>
+      <w:tblGrid>
+        <w:gridCol w:w="7100"/>
+        <w:gridCol w:w="2260"/>
+      </w:tblGrid>
+      <w:tr>
+        <w:tc>
+          <w:tcPr>
+            <w:tcW w:type="dxa" w:w="7100"/>
+            <w:shd w:fill="10243A" w:val="clear"/>
+            <w:tcMar>
+              <w:top w:type="dxa" w:w="100"/>
+              <w:left w:type="dxa" w:w="170"/>
+              <w:bottom w:type="dxa" w:w="100"/>
+              <w:right w:type="dxa" w:w="150"/>
+            </w:tcMar>
+          </w:tcPr>
+          <w:p>
+            <w:r>
+              <w:rPr>
+                <w:b/>
+                <w:bCs/>
+                <w:color w:val="FFFFFF"/>
+                <w:sz w:val="17"/>
+                <w:szCs w:val="17"/>
+                <w:spacing w:val="30"/>
+              </w:rPr>
+              <w:t xml:space="preserve">PART 12</w:t>
+            </w:r>
+            <w:r>
+              <w:rPr>
+                <w:b/>
+                <w:bCs/>
+                <w:color w:val="FFFFFF"/>
+                <w:sz w:val="17"/>
+                <w:szCs w:val="17"/>
+                <w:spacing w:val="20"/>
+              </w:rPr>
+              <w:t xml:space="preserve">    HANDING OFF TO VANCE</w:t>
+            </w:r>
+          </w:p>
+        </w:tc>
+        <w:tc>
+          <w:tcPr>
+            <w:tcW w:type="dxa" w:w="2260"/>
+            <w:shd w:fill="10243A" w:val="clear"/>
+            <w:tcMar>
+              <w:top w:type="dxa" w:w="100"/>
+              <w:left w:type="dxa" w:w="150"/>
+              <w:bottom w:type="dxa" w:w="100"/>
+              <w:right w:type="dxa" w:w="170"/>
+            </w:tcMar>
+          </w:tcPr>
+          <w:p>
+            <w:pPr>
+              <w:jc w:val="right"/>
+            </w:pPr>
+            <w:r>
+              <w:rPr>
+                <w:b/>
+                <w:bCs/>
+                <w:color w:val="FFFFFF"/>
+                <w:sz w:val="17"/>
+                <w:szCs w:val="17"/>
+                <w:spacing w:val="20"/>
+              </w:rPr>
+              <w:t xml:space="preserve">MIN 32–38</w:t>
+            </w:r>
+          </w:p>
+        </w:tc>
+      </w:tr>
+    </w:tbl>
+    <w:tbl>
+      <w:tblPr>
+        <w:tblW w:type="dxa" w:w="9360"/>
+        <w:tblBorders>
+          <w:top w:val="single" w:color="10243A" w:sz="8"/>
+          <w:left w:val="single" w:color="10243A" w:sz="8"/>
+          <w:bottom w:val="single" w:color="10243A" w:sz="8"/>
+          <w:right w:val="single" w:color="10243A" w:sz="8"/>
+          <w:insideH w:val="single" w:color="10243A" w:sz="8"/>
+          <w:insideV w:val="single" w:color="10243A" w:sz="8"/>
+        </w:tblBorders>
+      </w:tblPr>
+      <w:tblGrid>
+        <w:gridCol w:w="9360"/>
+      </w:tblGrid>
+      <w:tr>
+        <w:tc>
+          <w:tcPr>
+            <w:tcW w:type="dxa" w:w="9360"/>
+            <w:shd w:fill="F2F5F8" w:val="clear"/>
+            <w:tcMar>
+              <w:top w:type="dxa" w:w="110"/>
+              <w:left w:type="dxa" w:w="170"/>
+              <w:bottom w:type="dxa" w:w="110"/>
+              <w:right w:type="dxa" w:w="170"/>
+            </w:tcMar>
+          </w:tcPr>
+          <w:p>
+            <w:pPr>
+              <w:spacing w:after="0" w:line="275"/>
+            </w:pPr>
+            <w:r>
+              <w:rPr>
+                <w:b/>
+                <w:bCs/>
+                <w:color w:val="10243A"/>
+                <w:sz w:val="15"/>
+                <w:szCs w:val="15"/>
+                <w:spacing w:val="20"/>
+              </w:rPr>
+              <w:t xml:space="preserve">CUE   </w:t>
+            </w:r>
+            <w:r>
+              <w:rPr>
+                <w:i/>
+                <w:iCs/>
+                <w:color w:val="5F6B79"/>
+                <w:sz w:val="19"/>
+                <w:szCs w:val="19"/>
+              </w:rPr>
+              <w:t xml:space="preserve">Read all seven paragraphs straight through. Do not comment while you read.</w:t>
+            </w:r>
+          </w:p>
+        </w:tc>
+      </w:tr>
+      <w:tr>
+        <w:tc>
+          <w:tcPr>
+            <w:tcW w:type="dxa" w:w="9360"/>
+            <w:tcMar>
+              <w:top w:type="dxa" w:w="170"/>
+              <w:left w:type="dxa" w:w="200"/>
+              <w:bottom w:type="dxa" w:w="150"/>
+              <w:right w:type="dxa" w:w="200"/>
+            </w:tcMar>
+          </w:tcPr>
+          <w:p>
+            <w:pPr>
+              <w:spacing w:after="130" w:line="320"/>
+            </w:pPr>
+            <w:r>
+              <w:rPr>
+                <w:color w:val="1B1B1B"/>
+                <w:sz w:val="23"/>
+                <w:szCs w:val="23"/>
+              </w:rPr>
+              <w:t xml:space="preserve">I am going to read this straight through. Do not write yet. Just listen.</w:t>
+            </w:r>
+          </w:p>
+          <w:p>
+            <w:pPr>
+              <w:spacing w:before="60" w:after="110" w:line="280"/>
+              <w:ind w:left="300"/>
+            </w:pPr>
+            <w:r>
+              <w:rPr>
+                <w:i/>
+                <w:iCs/>
+                <w:color w:val="5F6B79"/>
+                <w:sz w:val="19"/>
+                <w:szCs w:val="19"/>
+              </w:rPr>
+              <w:t xml:space="preserve">Read all seven paragraphs. No commentary, no eyebrows, nothing.</w:t>
+            </w:r>
+          </w:p>
+          <w:p>
+            <w:pPr>
+              <w:spacing w:after="130" w:line="320"/>
+            </w:pPr>
+            <w:r>
+              <w:rPr>
+                <w:color w:val="1B1B1B"/>
+                <w:sz w:val="23"/>
+                <w:szCs w:val="23"/>
+              </w:rPr>
+              <w:t xml:space="preserve">Now look at your question sheet. Some of what you asked is in there. Some of it is not — and that is also information.</w:t>
+            </w:r>
+          </w:p>
+        </w:tc>
+      </w:tr>
+    </w:tbl>
+    <w:p>
+      <w:pPr>
+        <w:spacing w:after="230" w:line="276"/>
+      </w:pPr>
+      <w:r>
+        <w:rPr>
+          <w:color w:val="1B1B1B"/>
+          <w:sz w:val="21"/>
+          <w:szCs w:val="21"/>
+        </w:rPr>
+        <w:t xml:space="preserve"/>
+      </w:r>
+    </w:p>
+    <w:tbl>
+      <w:tblPr>
+        <w:tblW w:type="dxa" w:w="9360"/>
+        <w:tblBorders>
+          <w:top w:val="single" w:color="10243A" w:sz="8"/>
+          <w:left w:val="single" w:color="10243A" w:sz="8"/>
+          <w:bottom w:val="single" w:color="10243A" w:sz="8"/>
+          <w:right w:val="single" w:color="10243A" w:sz="8"/>
+          <w:insideH w:val="single" w:color="10243A" w:sz="8"/>
+          <w:insideV w:val="single" w:color="10243A" w:sz="8"/>
+        </w:tblBorders>
+      </w:tblPr>
+      <w:tblGrid>
+        <w:gridCol w:w="7100"/>
+        <w:gridCol w:w="2260"/>
+      </w:tblGrid>
+      <w:tr>
+        <w:tc>
+          <w:tcPr>
+            <w:tcW w:type="dxa" w:w="7100"/>
+            <w:shd w:fill="10243A" w:val="clear"/>
+            <w:tcMar>
+              <w:top w:type="dxa" w:w="100"/>
+              <w:left w:type="dxa" w:w="170"/>
+              <w:bottom w:type="dxa" w:w="100"/>
+              <w:right w:type="dxa" w:w="150"/>
+            </w:tcMar>
+          </w:tcPr>
+          <w:p>
+            <w:r>
+              <w:rPr>
+                <w:b/>
+                <w:bCs/>
+                <w:color w:val="FFFFFF"/>
+                <w:sz w:val="17"/>
+                <w:szCs w:val="17"/>
+                <w:spacing w:val="30"/>
+              </w:rPr>
+              <w:t xml:space="preserve">PART 13</w:t>
+            </w:r>
+            <w:r>
+              <w:rPr>
+                <w:b/>
+                <w:bCs/>
+                <w:color w:val="FFFFFF"/>
+                <w:sz w:val="17"/>
+                <w:szCs w:val="17"/>
+                <w:spacing w:val="20"/>
+              </w:rPr>
+              <w:t xml:space="preserve">    THE NOTES</w:t>
+            </w:r>
+          </w:p>
+        </w:tc>
+        <w:tc>
+          <w:tcPr>
+            <w:tcW w:type="dxa" w:w="2260"/>
+            <w:shd w:fill="10243A" w:val="clear"/>
+            <w:tcMar>
+              <w:top w:type="dxa" w:w="100"/>
+              <w:left w:type="dxa" w:w="150"/>
+              <w:bottom w:type="dxa" w:w="100"/>
+              <w:right w:type="dxa" w:w="170"/>
+            </w:tcMar>
+          </w:tcPr>
+          <w:p>
+            <w:pPr>
+              <w:jc w:val="right"/>
+            </w:pPr>
+            <w:r>
+              <w:rPr>
+                <w:b/>
+                <w:bCs/>
+                <w:color w:val="FFFFFF"/>
+                <w:sz w:val="17"/>
+                <w:szCs w:val="17"/>
+                <w:spacing w:val="20"/>
+              </w:rPr>
+              <w:t xml:space="preserve">MIN 38–55</w:t>
+            </w:r>
+          </w:p>
+        </w:tc>
+      </w:tr>
+    </w:tbl>
+    <w:tbl>
+      <w:tblPr>
+        <w:tblW w:type="dxa" w:w="9360"/>
+        <w:tblBorders>
+          <w:top w:val="single" w:color="10243A" w:sz="8"/>
+          <w:left w:val="single" w:color="10243A" w:sz="8"/>
+          <w:bottom w:val="single" w:color="10243A" w:sz="8"/>
+          <w:right w:val="single" w:color="10243A" w:sz="8"/>
+          <w:insideH w:val="single" w:color="10243A" w:sz="8"/>
+          <w:insideV w:val="single" w:color="10243A" w:sz="8"/>
+        </w:tblBorders>
+      </w:tblPr>
+      <w:tblGrid>
+        <w:gridCol w:w="9360"/>
+      </w:tblGrid>
+      <w:tr>
+        <w:tc>
+          <w:tcPr>
+            <w:tcW w:type="dxa" w:w="9360"/>
+            <w:shd w:fill="F2F5F8" w:val="clear"/>
+            <w:tcMar>
+              <w:top w:type="dxa" w:w="110"/>
+              <w:left w:type="dxa" w:w="170"/>
+              <w:bottom w:type="dxa" w:w="110"/>
+              <w:right w:type="dxa" w:w="170"/>
+            </w:tcMar>
+          </w:tcPr>
+          <w:p>
+            <w:pPr>
+              <w:spacing w:after="0" w:line="275"/>
+            </w:pPr>
+            <w:r>
+              <w:rPr>
+                <w:b/>
+                <w:bCs/>
+                <w:color w:val="10243A"/>
+                <w:sz w:val="15"/>
+                <w:szCs w:val="15"/>
+                <w:spacing w:val="20"/>
+              </w:rPr>
+              <w:t xml:space="preserve">CUE   </w:t>
+            </w:r>
+            <w:r>
+              <w:rPr>
+                <w:i/>
+                <w:iCs/>
+                <w:color w:val="5F6B79"/>
+                <w:sz w:val="19"/>
+                <w:szCs w:val="19"/>
+              </w:rPr>
+              <w:t xml:space="preserve">They work her statement for anything new. Attribution is the whole skill here.</w:t>
+            </w:r>
+          </w:p>
+        </w:tc>
+      </w:tr>
+      <w:tr>
+        <w:tc>
+          <w:tcPr>
+            <w:tcW w:type="dxa" w:w="9360"/>
+            <w:tcMar>
+              <w:top w:type="dxa" w:w="170"/>
+              <w:left w:type="dxa" w:w="200"/>
+              <w:bottom w:type="dxa" w:w="150"/>
+              <w:right w:type="dxa" w:w="200"/>
+            </w:tcMar>
+          </w:tcPr>
+          <w:p>
+            <w:pPr>
+              <w:spacing w:after="130" w:line="320"/>
+            </w:pPr>
+            <w:r>
+              <w:rPr>
+                <w:color w:val="1B1B1B"/>
+                <w:sz w:val="23"/>
+                <w:szCs w:val="23"/>
+              </w:rPr>
+              <w:t xml:space="preserve">Seventeen minutes. Go through her statement and pull out everything that is new.</w:t>
+            </w:r>
+          </w:p>
+          <w:p>
+            <w:pPr>
+              <w:spacing w:after="130" w:line="320"/>
+            </w:pPr>
+            <w:r>
+              <w:rPr>
+                <w:color w:val="1B1B1B"/>
+                <w:sz w:val="23"/>
+                <w:szCs w:val="23"/>
+              </w:rPr>
+              <w:t xml:space="preserve">One rule. Every line you write gets a name on it. Not “the door was unlocked” — “Vance stated the door is on a timer.” Not “there were nine laptops” — “Vance stated she counted nine on Friday afternoon.”</w:t>
+            </w:r>
+          </w:p>
+          <w:p>
+            <w:pPr>
+              <w:spacing w:after="130" w:line="320"/>
+            </w:pPr>
+            <w:r>
+              <w:rPr>
+                <w:color w:val="1B1B1B"/>
+                <w:sz w:val="23"/>
+                <w:szCs w:val="23"/>
+              </w:rPr>
+              <w:t xml:space="preserve">Everything gets attributed. Every single thing.</w:t>
+            </w:r>
+          </w:p>
+        </w:tc>
+      </w:tr>
+    </w:tbl>
+    <w:p>
+      <w:pPr>
+        <w:spacing w:after="230" w:line="276"/>
+      </w:pPr>
+      <w:r>
+        <w:rPr>
+          <w:color w:val="1B1B1B"/>
+          <w:sz w:val="21"/>
+          <w:szCs w:val="21"/>
+        </w:rPr>
+        <w:t xml:space="preserve"/>
+      </w:r>
+    </w:p>
+    <w:tbl>
+      <w:tblPr>
+        <w:tblW w:type="dxa" w:w="9360"/>
+        <w:tblBorders>
+          <w:top w:val="single" w:color="9A3412" w:sz="8"/>
+          <w:left w:val="single" w:color="9A3412" w:sz="8"/>
+          <w:bottom w:val="single" w:color="9A3412" w:sz="8"/>
+          <w:right w:val="single" w:color="9A3412" w:sz="8"/>
+          <w:insideH w:val="single" w:color="9A3412" w:sz="8"/>
+          <w:insideV w:val="single" w:color="9A3412" w:sz="8"/>
+        </w:tblBorders>
+      </w:tblPr>
+      <w:tblGrid>
+        <w:gridCol w:w="7100"/>
+        <w:gridCol w:w="2260"/>
+      </w:tblGrid>
+      <w:tr>
+        <w:tc>
+          <w:tcPr>
+            <w:tcW w:type="dxa" w:w="7100"/>
+            <w:shd w:fill="9A3412" w:val="clear"/>
+            <w:tcMar>
+              <w:top w:type="dxa" w:w="100"/>
+              <w:left w:type="dxa" w:w="170"/>
+              <w:bottom w:type="dxa" w:w="100"/>
+              <w:right w:type="dxa" w:w="150"/>
+            </w:tcMar>
+          </w:tcPr>
+          <w:p>
+            <w:r>
+              <w:rPr>
+                <w:b/>
+                <w:bCs/>
+                <w:color w:val="FFFFFF"/>
+                <w:sz w:val="17"/>
+                <w:szCs w:val="17"/>
+                <w:spacing w:val="30"/>
+              </w:rPr>
+              <w:t xml:space="preserve">PART 14</w:t>
+            </w:r>
+            <w:r>
+              <w:rPr>
+                <w:b/>
+                <w:bCs/>
+                <w:color w:val="FFFFFF"/>
+                <w:sz w:val="17"/>
+                <w:szCs w:val="17"/>
+                <w:spacing w:val="20"/>
+              </w:rPr>
+              <w:t xml:space="preserve">    SEND-OFF — ASSIGNMENT 2B</w:t>
+            </w:r>
+          </w:p>
+        </w:tc>
+        <w:tc>
+          <w:tcPr>
+            <w:tcW w:type="dxa" w:w="2260"/>
+            <w:shd w:fill="9A3412" w:val="clear"/>
+            <w:tcMar>
+              <w:top w:type="dxa" w:w="100"/>
+              <w:left w:type="dxa" w:w="150"/>
+              <w:bottom w:type="dxa" w:w="100"/>
+              <w:right w:type="dxa" w:w="170"/>
+            </w:tcMar>
+          </w:tcPr>
+          <w:p>
+            <w:pPr>
+              <w:jc w:val="right"/>
+            </w:pPr>
+            <w:r>
+              <w:rPr>
+                <w:b/>
+                <w:bCs/>
+                <w:color w:val="FFFFFF"/>
+                <w:sz w:val="17"/>
+                <w:szCs w:val="17"/>
+                <w:spacing w:val="20"/>
+              </w:rPr>
+              <w:t xml:space="preserve">MIN 55</w:t>
+            </w:r>
+          </w:p>
+        </w:tc>
+      </w:tr>
+    </w:tbl>
+    <w:tbl>
+      <w:tblPr>
+        <w:tblW w:type="dxa" w:w="9360"/>
+        <w:tblBorders>
+          <w:top w:val="single" w:color="9A3412" w:sz="8"/>
+          <w:left w:val="single" w:color="9A3412" w:sz="8"/>
+          <w:bottom w:val="single" w:color="9A3412" w:sz="8"/>
+          <w:right w:val="single" w:color="9A3412" w:sz="8"/>
+          <w:insideH w:val="single" w:color="9A3412" w:sz="8"/>
+          <w:insideV w:val="single" w:color="9A3412" w:sz="8"/>
+        </w:tblBorders>
+      </w:tblPr>
+      <w:tblGrid>
+        <w:gridCol w:w="9360"/>
+      </w:tblGrid>
+      <w:tr>
+        <w:tc>
+          <w:tcPr>
+            <w:tcW w:type="dxa" w:w="9360"/>
+            <w:shd w:fill="FDF3EC" w:val="clear"/>
+            <w:tcMar>
+              <w:top w:type="dxa" w:w="110"/>
+              <w:left w:type="dxa" w:w="170"/>
+              <w:bottom w:type="dxa" w:w="110"/>
+              <w:right w:type="dxa" w:w="170"/>
+            </w:tcMar>
+          </w:tcPr>
+          <w:p>
+            <w:pPr>
+              <w:spacing w:after="0" w:line="275"/>
+            </w:pPr>
+            <w:r>
+              <w:rPr>
+                <w:b/>
+                <w:bCs/>
+                <w:color w:val="9A3412"/>
+                <w:sz w:val="15"/>
+                <w:szCs w:val="15"/>
+                <w:spacing w:val="20"/>
+              </w:rPr>
+              <w:t xml:space="preserve">CUE   </w:t>
+            </w:r>
+            <w:r>
+              <w:rPr>
+                <w:i/>
+                <w:iCs/>
+                <w:color w:val="5F6B79"/>
+                <w:sz w:val="19"/>
+                <w:szCs w:val="19"/>
+              </w:rPr>
+              <w:t xml:space="preserve">Supplemental Report, same Canvas assignment as her statement. Twenty-five minutes.</w:t>
+            </w:r>
+          </w:p>
+        </w:tc>
+      </w:tr>
+      <w:tr>
+        <w:tc>
+          <w:tcPr>
+            <w:tcW w:type="dxa" w:w="9360"/>
+            <w:tcMar>
+              <w:top w:type="dxa" w:w="170"/>
+              <w:left w:type="dxa" w:w="200"/>
+              <w:bottom w:type="dxa" w:w="150"/>
+              <w:right w:type="dxa" w:w="200"/>
+            </w:tcMar>
+          </w:tcPr>
+          <w:p>
+            <w:pPr>
+              <w:spacing w:after="130" w:line="320"/>
+            </w:pPr>
+            <w:r>
+              <w:rPr>
+                <w:color w:val="1B1B1B"/>
+                <w:sz w:val="23"/>
+                <w:szCs w:val="23"/>
+              </w:rPr>
+              <w:t xml:space="preserve">Supplemental Report, same assignment. Twenty-five minutes.</w:t>
+            </w:r>
+          </w:p>
+          <w:p>
+            <w:pPr>
+              <w:spacing w:after="130" w:line="320"/>
+            </w:pPr>
+            <w:r>
+              <w:rPr>
+                <w:color w:val="1B1B1B"/>
+                <w:sz w:val="23"/>
+                <w:szCs w:val="23"/>
+              </w:rPr>
+              <w:t xml:space="preserve">A supplement adds to your original report. It does not repeat it and it does not replace it. New information only.</w:t>
+            </w:r>
+          </w:p>
+          <w:p>
+            <w:pPr>
+              <w:spacing w:after="130" w:line="320"/>
+            </w:pPr>
+            <w:r>
+              <w:rPr>
+                <w:color w:val="1B1B1B"/>
+                <w:sz w:val="23"/>
+                <w:szCs w:val="23"/>
+              </w:rPr>
+              <w:t xml:space="preserve">Block 3 is the one that was empty on Tuesday — property. You can fill it in now. Nine laptops, Dell, asset tags, what they cost. And you say who told you.</w:t>
+            </w:r>
+          </w:p>
+          <w:p>
+            <w:pPr>
+              <w:spacing w:after="130" w:line="320"/>
+            </w:pPr>
+            <w:r>
+              <w:rPr>
+                <w:color w:val="1B1B1B"/>
+                <w:sz w:val="23"/>
+                <w:szCs w:val="23"/>
+              </w:rPr>
+              <w:t xml:space="preserve">Go.</w:t>
+            </w:r>
+          </w:p>
+        </w:tc>
+      </w:tr>
+    </w:tbl>
+    <w:p>
+      <w:pPr>
+        <w:spacing w:after="230" w:line="276"/>
+      </w:pPr>
+      <w:r>
+        <w:rPr>
+          <w:color w:val="1B1B1B"/>
+          <w:sz w:val="21"/>
+          <w:szCs w:val="21"/>
+        </w:rPr>
+        <w:t xml:space="preserve"/>
+      </w:r>
+    </w:p>
+    <w:tbl>
+      <w:tblPr>
+        <w:tblW w:type="dxa" w:w="9360"/>
+        <w:tblBorders>
+          <w:top w:val="single" w:color="10243A" w:sz="8"/>
+          <w:left w:val="single" w:color="10243A" w:sz="8"/>
+          <w:bottom w:val="single" w:color="10243A" w:sz="8"/>
+          <w:right w:val="single" w:color="10243A" w:sz="8"/>
+          <w:insideH w:val="single" w:color="10243A" w:sz="8"/>
+          <w:insideV w:val="single" w:color="10243A" w:sz="8"/>
+        </w:tblBorders>
+      </w:tblPr>
+      <w:tblGrid>
+        <w:gridCol w:w="7100"/>
+        <w:gridCol w:w="2260"/>
+      </w:tblGrid>
+      <w:tr>
+        <w:tc>
+          <w:tcPr>
+            <w:tcW w:type="dxa" w:w="7100"/>
+            <w:shd w:fill="10243A" w:val="clear"/>
+            <w:tcMar>
+              <w:top w:type="dxa" w:w="100"/>
+              <w:left w:type="dxa" w:w="170"/>
+              <w:bottom w:type="dxa" w:w="100"/>
+              <w:right w:type="dxa" w:w="150"/>
+            </w:tcMar>
+          </w:tcPr>
+          <w:p>
+            <w:r>
+              <w:rPr>
+                <w:b/>
+                <w:bCs/>
+                <w:color w:val="FFFFFF"/>
+                <w:sz w:val="17"/>
+                <w:szCs w:val="17"/>
+                <w:spacing w:val="30"/>
+              </w:rPr>
+              <w:t xml:space="preserve">PART 15</w:t>
+            </w:r>
+            <w:r>
+              <w:rPr>
+                <w:b/>
+                <w:bCs/>
+                <w:color w:val="FFFFFF"/>
+                <w:sz w:val="17"/>
+                <w:szCs w:val="17"/>
+                <w:spacing w:val="20"/>
+              </w:rPr>
+              <w:t xml:space="preserve">    THE CONTRADICTION — THE LANDING</w:t>
+            </w:r>
+          </w:p>
+        </w:tc>
+        <w:tc>
+          <w:tcPr>
+            <w:tcW w:type="dxa" w:w="2260"/>
+            <w:shd w:fill="10243A" w:val="clear"/>
+            <w:tcMar>
+              <w:top w:type="dxa" w:w="100"/>
+              <w:left w:type="dxa" w:w="150"/>
+              <w:bottom w:type="dxa" w:w="100"/>
+              <w:right w:type="dxa" w:w="170"/>
+            </w:tcMar>
+          </w:tcPr>
+          <w:p>
+            <w:pPr>
+              <w:jc w:val="right"/>
+            </w:pPr>
+            <w:r>
+              <w:rPr>
+                <w:b/>
+                <w:bCs/>
+                <w:color w:val="FFFFFF"/>
+                <w:sz w:val="17"/>
+                <w:szCs w:val="17"/>
+                <w:spacing w:val="20"/>
+              </w:rPr>
+              <w:t xml:space="preserve">MIN 80–90</w:t>
+            </w:r>
+          </w:p>
+        </w:tc>
+      </w:tr>
+    </w:tbl>
+    <w:tbl>
+      <w:tblPr>
+        <w:tblW w:type="dxa" w:w="9360"/>
+        <w:tblBorders>
+          <w:top w:val="single" w:color="10243A" w:sz="8"/>
+          <w:left w:val="single" w:color="10243A" w:sz="8"/>
+          <w:bottom w:val="single" w:color="10243A" w:sz="8"/>
+          <w:right w:val="single" w:color="10243A" w:sz="8"/>
+          <w:insideH w:val="single" w:color="10243A" w:sz="8"/>
+          <w:insideV w:val="single" w:color="10243A" w:sz="8"/>
+        </w:tblBorders>
+      </w:tblPr>
+      <w:tblGrid>
+        <w:gridCol w:w="9360"/>
+      </w:tblGrid>
+      <w:tr>
+        <w:tc>
+          <w:tcPr>
+            <w:tcW w:type="dxa" w:w="9360"/>
+            <w:shd w:fill="F2F5F8" w:val="clear"/>
+            <w:tcMar>
+              <w:top w:type="dxa" w:w="110"/>
+              <w:left w:type="dxa" w:w="170"/>
+              <w:bottom w:type="dxa" w:w="110"/>
+              <w:right w:type="dxa" w:w="170"/>
+            </w:tcMar>
+          </w:tcPr>
+          <w:p>
+            <w:pPr>
+              <w:spacing w:after="0" w:line="275"/>
+            </w:pPr>
+            <w:r>
+              <w:rPr>
+                <w:b/>
+                <w:bCs/>
+                <w:color w:val="10243A"/>
+                <w:sz w:val="15"/>
+                <w:szCs w:val="15"/>
+                <w:spacing w:val="20"/>
+              </w:rPr>
+              <w:t xml:space="preserve">CUE   </w:t>
+            </w:r>
+            <w:r>
+              <w:rPr>
+                <w:i/>
+                <w:iCs/>
+                <w:color w:val="5F6B79"/>
+                <w:sz w:val="19"/>
+                <w:szCs w:val="19"/>
+              </w:rPr>
+              <w:t xml:space="preserve">Stop everyone. Put both lines side by side on the board. This is the most valuable ten minutes in either block.</w:t>
+            </w:r>
+          </w:p>
+        </w:tc>
+      </w:tr>
+      <w:tr>
+        <w:tc>
+          <w:tcPr>
+            <w:tcW w:type="dxa" w:w="9360"/>
+            <w:tcMar>
+              <w:top w:type="dxa" w:w="170"/>
+              <w:left w:type="dxa" w:w="200"/>
+              <w:bottom w:type="dxa" w:w="150"/>
+              <w:right w:type="dxa" w:w="200"/>
+            </w:tcMar>
+          </w:tcPr>
+          <w:p>
+            <w:pPr>
+              <w:spacing w:after="130" w:line="320"/>
+            </w:pPr>
+            <w:r>
+              <w:rPr>
+                <w:color w:val="1B1B1B"/>
+                <w:sz w:val="23"/>
+                <w:szCs w:val="23"/>
+              </w:rPr>
+              <w:t xml:space="preserve">Stop. Everybody look up.</w:t>
+            </w:r>
+          </w:p>
+          <w:p>
+            <w:pPr>
+              <w:spacing w:before="60" w:after="110" w:line="280"/>
+              <w:ind w:left="300"/>
+            </w:pPr>
+            <w:r>
+              <w:rPr>
+                <w:i/>
+                <w:iCs/>
+                <w:color w:val="5F6B79"/>
+                <w:sz w:val="19"/>
+                <w:szCs w:val="19"/>
+              </w:rPr>
+              <w:t xml:space="preserve">Put both lines on the board, side by side.</w:t>
+            </w:r>
+          </w:p>
+          <w:p>
+            <w:pPr>
+              <w:spacing w:after="130" w:line="320"/>
+            </w:pPr>
+            <w:r>
+              <w:rPr>
+                <w:color w:val="1B1B1B"/>
+                <w:sz w:val="23"/>
+                <w:szCs w:val="23"/>
+              </w:rPr>
+              <w:t xml:space="preserve">Delgado told you the back door should not be unlocked after ten.</w:t>
+            </w:r>
+          </w:p>
+          <w:p>
+            <w:pPr>
+              <w:spacing w:after="130" w:line="320"/>
+            </w:pPr>
+            <w:r>
+              <w:rPr>
+                <w:color w:val="1B1B1B"/>
+                <w:sz w:val="23"/>
+                <w:szCs w:val="23"/>
+              </w:rPr>
+              <w:t xml:space="preserve">Vance told you it is on a timer that locks at nine — but that it does not always catch, and she has put in two work orders nobody answered.</w:t>
+            </w:r>
+          </w:p>
+          <w:p>
+            <w:pPr>
+              <w:spacing w:after="130" w:line="320"/>
+            </w:pPr>
+            <w:r>
+              <w:rPr>
+                <w:color w:val="1B1B1B"/>
+                <w:sz w:val="23"/>
+                <w:szCs w:val="23"/>
+              </w:rPr>
+              <w:t xml:space="preserve">Those do not match. So which one of them lied to you?</w:t>
+            </w:r>
+          </w:p>
+          <w:p>
+            <w:pPr>
+              <w:spacing w:before="60" w:after="110" w:line="280"/>
+              <w:ind w:left="300"/>
+            </w:pPr>
+            <w:r>
+              <w:rPr>
+                <w:i/>
+                <w:iCs/>
+                <w:color w:val="5F6B79"/>
+                <w:sz w:val="19"/>
+                <w:szCs w:val="19"/>
+              </w:rPr>
+              <w:t xml:space="preserve">Take it. Let them argue. Then land it.</w:t>
+            </w:r>
+          </w:p>
+          <w:p>
+            <w:pPr>
+              <w:spacing w:after="130" w:line="320"/>
+            </w:pPr>
+            <w:r>
+              <w:rPr>
+                <w:color w:val="1B1B1B"/>
+                <w:sz w:val="23"/>
+                <w:szCs w:val="23"/>
+              </w:rPr>
+              <w:t xml:space="preserve">Neither. Neither one of them lied to you. They each know a piece of it. Ray knows the rule. Vance knows the rule and she knows the door is broken.</w:t>
+            </w:r>
+          </w:p>
+          <w:p>
+            <w:pPr>
+              <w:spacing w:after="130" w:line="320"/>
+            </w:pPr>
+            <w:r>
+              <w:rPr>
+                <w:color w:val="1B1B1B"/>
+                <w:sz w:val="23"/>
+                <w:szCs w:val="23"/>
+              </w:rPr>
+              <w:t xml:space="preserve">You do not get to pick a winner. You are not the judge and you are not the jury. You write both, you put a name on each one, and you let the investigation sort it out.</w:t>
+            </w:r>
+          </w:p>
+          <w:p>
+            <w:pPr>
+              <w:spacing w:after="130" w:line="320"/>
+            </w:pPr>
+            <w:r>
+              <w:rPr>
+                <w:color w:val="1B1B1B"/>
+                <w:sz w:val="23"/>
+                <w:szCs w:val="23"/>
+              </w:rPr>
+              <w:t xml:space="preserve">Exit ticket. One sentence. Write the sentence you would actually put in your report that handles both of them. One sentence and you are out.</w:t>
+            </w:r>
+          </w:p>
+        </w:tc>
+      </w:tr>
+    </w:tbl>
+    <w:p>
+      <w:pPr>
+        <w:spacing w:after="230" w:line="276"/>
+      </w:pPr>
+      <w:r>
+        <w:rPr>
+          <w:color w:val="1B1B1B"/>
+          <w:sz w:val="21"/>
+          <w:szCs w:val="21"/>
+        </w:rPr>
+        <w:t xml:space="preserve"/>
+      </w:r>
+    </w:p>
+    <w:tbl>
+      <w:tblPr>
+        <w:tblW w:type="dxa" w:w="9360"/>
+        <w:tblBorders>
+          <w:top w:val="single" w:color="10243A" w:sz="8"/>
+          <w:left w:val="single" w:color="10243A" w:sz="8"/>
+          <w:bottom w:val="single" w:color="10243A" w:sz="8"/>
+          <w:right w:val="single" w:color="10243A" w:sz="8"/>
+          <w:insideH w:val="single" w:color="10243A" w:sz="8"/>
+          <w:insideV w:val="single" w:color="10243A" w:sz="8"/>
+        </w:tblBorders>
+      </w:tblPr>
+      <w:tblGrid>
+        <w:gridCol w:w="7100"/>
+        <w:gridCol w:w="2260"/>
+      </w:tblGrid>
+      <w:tr>
+        <w:tc>
+          <w:tcPr>
+            <w:tcW w:type="dxa" w:w="7100"/>
+            <w:shd w:fill="10243A" w:val="clear"/>
+            <w:tcMar>
+              <w:top w:type="dxa" w:w="100"/>
+              <w:left w:type="dxa" w:w="170"/>
+              <w:bottom w:type="dxa" w:w="100"/>
+              <w:right w:type="dxa" w:w="150"/>
+            </w:tcMar>
+          </w:tcPr>
+          <w:p>
+            <w:r>
+              <w:rPr>
+                <w:b/>
+                <w:bCs/>
+                <w:color w:val="FFFFFF"/>
+                <w:sz w:val="17"/>
+                <w:szCs w:val="17"/>
+                <w:spacing w:val="30"/>
+              </w:rPr>
+              <w:t xml:space="preserve">PART 16</w:t>
+            </w:r>
+            <w:r>
+              <w:rPr>
+                <w:b/>
+                <w:bCs/>
+                <w:color w:val="FFFFFF"/>
+                <w:sz w:val="17"/>
+                <w:szCs w:val="17"/>
+                <w:spacing w:val="20"/>
+              </w:rPr>
+              <w:t xml:space="preserve">    THE HAND-ON</w:t>
+            </w:r>
+          </w:p>
+        </w:tc>
+        <w:tc>
+          <w:tcPr>
+            <w:tcW w:type="dxa" w:w="2260"/>
+            <w:shd w:fill="10243A" w:val="clear"/>
+            <w:tcMar>
+              <w:top w:type="dxa" w:w="100"/>
+              <w:left w:type="dxa" w:w="150"/>
+              <w:bottom w:type="dxa" w:w="100"/>
+              <w:right w:type="dxa" w:w="170"/>
+            </w:tcMar>
+          </w:tcPr>
+          <w:p>
+            <w:pPr>
+              <w:jc w:val="right"/>
+            </w:pPr>
+            <w:r>
+              <w:rPr>
+                <w:b/>
+                <w:bCs/>
+                <w:color w:val="FFFFFF"/>
+                <w:sz w:val="17"/>
+                <w:szCs w:val="17"/>
+                <w:spacing w:val="20"/>
+              </w:rPr>
+              <w:t xml:space="preserve">MIN 90</w:t>
+            </w:r>
+          </w:p>
+        </w:tc>
+      </w:tr>
+    </w:tbl>
+    <w:tbl>
+      <w:tblPr>
+        <w:tblW w:type="dxa" w:w="9360"/>
+        <w:tblBorders>
+          <w:top w:val="single" w:color="10243A" w:sz="8"/>
+          <w:left w:val="single" w:color="10243A" w:sz="8"/>
+          <w:bottom w:val="single" w:color="10243A" w:sz="8"/>
+          <w:right w:val="single" w:color="10243A" w:sz="8"/>
+          <w:insideH w:val="single" w:color="10243A" w:sz="8"/>
+          <w:insideV w:val="single" w:color="10243A" w:sz="8"/>
+        </w:tblBorders>
+      </w:tblPr>
+      <w:tblGrid>
+        <w:gridCol w:w="9360"/>
+      </w:tblGrid>
+      <w:tr>
+        <w:tc>
+          <w:tcPr>
+            <w:tcW w:type="dxa" w:w="9360"/>
+            <w:shd w:fill="F2F5F8" w:val="clear"/>
+            <w:tcMar>
+              <w:top w:type="dxa" w:w="110"/>
+              <w:left w:type="dxa" w:w="170"/>
+              <w:bottom w:type="dxa" w:w="110"/>
+              <w:right w:type="dxa" w:w="170"/>
+            </w:tcMar>
+          </w:tcPr>
+          <w:p>
+            <w:pPr>
+              <w:spacing w:after="0" w:line="275"/>
+            </w:pPr>
+            <w:r>
+              <w:rPr>
+                <w:b/>
+                <w:bCs/>
+                <w:color w:val="10243A"/>
+                <w:sz w:val="15"/>
+                <w:szCs w:val="15"/>
+                <w:spacing w:val="20"/>
+              </w:rPr>
+              <w:t xml:space="preserve">CUE   </w:t>
+            </w:r>
+            <w:r>
+              <w:rPr>
+                <w:i/>
+                <w:iCs/>
+                <w:color w:val="5F6B79"/>
+                <w:sz w:val="19"/>
+                <w:szCs w:val="19"/>
+              </w:rPr>
+              <w:t xml:space="preserve">Ten seconds as they pack up. Sets up Lesson 3.</w:t>
+            </w:r>
+          </w:p>
+        </w:tc>
+      </w:tr>
+      <w:tr>
+        <w:tc>
+          <w:tcPr>
+            <w:tcW w:type="dxa" w:w="9360"/>
+            <w:tcMar>
+              <w:top w:type="dxa" w:w="170"/>
+              <w:left w:type="dxa" w:w="200"/>
+              <w:bottom w:type="dxa" w:w="150"/>
+              <w:right w:type="dxa" w:w="200"/>
+            </w:tcMar>
+          </w:tcPr>
+          <w:p>
+            <w:pPr>
+              <w:spacing w:after="130" w:line="320"/>
+            </w:pPr>
+            <w:r>
+              <w:rPr>
+                <w:color w:val="1B1B1B"/>
+                <w:sz w:val="23"/>
+                <w:szCs w:val="23"/>
+              </w:rPr>
+              <w:t xml:space="preserve">Keep all of it — Tuesday’s and today’s. Next time you finally have enough to write the actual narrative. That is the part that goes to the prosecutor.</w:t>
+            </w:r>
+          </w:p>
+        </w:tc>
+      </w:tr>
+    </w:tbl>
+    <w:p>
+      <w:pPr>
+        <w:spacing w:after="230" w:line="276"/>
+      </w:pPr>
+      <w:r>
+        <w:rPr>
+          <w:color w:val="1B1B1B"/>
+          <w:sz w:val="21"/>
+          <w:szCs w:val="21"/>
+        </w:rPr>
+        <w:t xml:space="preserve"/>
+      </w:r>
+    </w:p>
+    <w:p>
+      <w:r>
+        <w:br w:type="page"/>
+      </w:r>
+    </w:p>
+    <w:p>
+      <w:pPr>
+        <w:spacing w:after="60"/>
+      </w:pPr>
+      <w:r>
+        <w:rPr>
+          <w:b/>
+          <w:bCs/>
+          <w:color w:val="10243A"/>
+          <w:sz w:val="32"/>
+          <w:szCs w:val="32"/>
+        </w:rPr>
+        <w:t xml:space="preserve">If it comes up</w:t>
+      </w:r>
+    </w:p>
+    <w:p>
+      <w:pPr>
+        <w:spacing w:after="200" w:line="290"/>
+      </w:pPr>
+      <w:r>
+        <w:rPr>
+          <w:color w:val="5F6B79"/>
+          <w:sz w:val="21"/>
+          <w:szCs w:val="21"/>
+        </w:rPr>
+        <w:t xml:space="preserve">These two happen in nearly every room. You do not have to go looking for them, but have the words ready.</w:t>
+      </w:r>
+    </w:p>
+    <w:tbl>
+      <w:tblPr>
+        <w:tblW w:type="dxa" w:w="9360"/>
+        <w:tblBorders>
+          <w:top w:val="single" w:color="1A5FB4" w:sz="8"/>
+          <w:left w:val="single" w:color="1A5FB4" w:sz="8"/>
+          <w:bottom w:val="single" w:color="1A5FB4" w:sz="8"/>
+          <w:right w:val="single" w:color="1A5FB4" w:sz="8"/>
+          <w:insideH w:val="single" w:color="1A5FB4" w:sz="8"/>
+          <w:insideV w:val="single" w:color="1A5FB4" w:sz="8"/>
+        </w:tblBorders>
+      </w:tblPr>
+      <w:tblGrid>
+        <w:gridCol w:w="9360"/>
+      </w:tblGrid>
+      <w:tr>
+        <w:tc>
+          <w:tcPr>
+            <w:tcW w:type="dxa" w:w="9360"/>
+            <w:shd w:fill="F2F5F8" w:val="clear"/>
+            <w:tcMar>
+              <w:top w:type="dxa" w:w="110"/>
+              <w:left w:type="dxa" w:w="170"/>
+              <w:bottom w:type="dxa" w:w="110"/>
+              <w:right w:type="dxa" w:w="170"/>
+            </w:tcMar>
+          </w:tcPr>
+          <w:p>
+            <w:pPr>
+              <w:spacing w:after="0" w:line="280"/>
+            </w:pPr>
+            <w:r>
+              <w:rPr>
+                <w:b/>
+                <w:bCs/>
+                <w:color w:val="1A5FB4"/>
+                <w:sz w:val="15"/>
+                <w:szCs w:val="15"/>
+                <w:spacing w:val="20"/>
+              </w:rPr>
+              <w:t xml:space="preserve">WHEN   </w:t>
+            </w:r>
+            <w:r>
+              <w:rPr>
+                <w:b/>
+                <w:bCs/>
+                <w:color w:val="1B1B1B"/>
+                <w:sz w:val="20"/>
+                <w:szCs w:val="20"/>
+              </w:rPr>
+              <w:t xml:space="preserve">Somebody says Dontae Rivers did it.</w:t>
+            </w:r>
+          </w:p>
+        </w:tc>
+      </w:tr>
+      <w:tr>
+        <w:tc>
+          <w:tcPr>
+            <w:tcW w:type="dxa" w:w="9360"/>
+            <w:tcMar>
+              <w:top w:type="dxa" w:w="170"/>
+              <w:left w:type="dxa" w:w="200"/>
+              <w:bottom w:type="dxa" w:w="150"/>
+              <w:right w:type="dxa" w:w="200"/>
+            </w:tcMar>
+          </w:tcPr>
+          <w:p>
+            <w:pPr>
+              <w:spacing w:after="130" w:line="320"/>
+            </w:pPr>
+            <w:r>
+              <w:rPr>
+                <w:color w:val="1B1B1B"/>
+                <w:sz w:val="23"/>
+                <w:szCs w:val="23"/>
+              </w:rPr>
+              <w:t xml:space="preserve">Read me the sentence that says he did it.</w:t>
+            </w:r>
+          </w:p>
+          <w:p>
+            <w:pPr>
+              <w:spacing w:before="60" w:after="110" w:line="280"/>
+              <w:ind w:left="300"/>
+            </w:pPr>
+            <w:r>
+              <w:rPr>
+                <w:i/>
+                <w:iCs/>
+                <w:color w:val="5F6B79"/>
+                <w:sz w:val="19"/>
+                <w:szCs w:val="19"/>
+              </w:rPr>
+              <w:t xml:space="preserve">There is not one. She says “I am not saying this man did anything.”</w:t>
+            </w:r>
+          </w:p>
+          <w:p>
+            <w:pPr>
+              <w:spacing w:after="130" w:line="320"/>
+            </w:pPr>
+            <w:r>
+              <w:rPr>
+                <w:color w:val="1B1B1B"/>
+                <w:sz w:val="23"/>
+                <w:szCs w:val="23"/>
+              </w:rPr>
+              <w:t xml:space="preserve">She told you about him because you asked who has keys. And his key opened the building, not the equipment room — she said that too.</w:t>
+            </w:r>
+          </w:p>
+          <w:p>
+            <w:pPr>
+              <w:spacing w:after="130" w:line="320"/>
+            </w:pPr>
+            <w:r>
+              <w:rPr>
+                <w:color w:val="1B1B1B"/>
+                <w:sz w:val="23"/>
+                <w:szCs w:val="23"/>
+              </w:rPr>
+              <w:t xml:space="preserve">So what is the lead? The lead is: find out whether that key ever came back. That is an action, somebody can go and do it.</w:t>
+            </w:r>
+          </w:p>
+          <w:p>
+            <w:pPr>
+              <w:spacing w:after="130" w:line="320"/>
+            </w:pPr>
+            <w:r>
+              <w:rPr>
+                <w:color w:val="1B1B1B"/>
+                <w:sz w:val="23"/>
+                <w:szCs w:val="23"/>
+              </w:rPr>
+              <w:t xml:space="preserve">“He did it” is a conclusion. Conclusions do not go in reports.</w:t>
+            </w:r>
+          </w:p>
+        </w:tc>
+      </w:tr>
+    </w:tbl>
+    <w:p>
+      <w:pPr>
+        <w:spacing w:after="230" w:line="276"/>
+      </w:pPr>
+      <w:r>
+        <w:rPr>
+          <w:color w:val="1B1B1B"/>
+          <w:sz w:val="21"/>
+          <w:szCs w:val="21"/>
+        </w:rPr>
+        <w:t xml:space="preserve"/>
+      </w:r>
+    </w:p>
+    <w:tbl>
+      <w:tblPr>
+        <w:tblW w:type="dxa" w:w="9360"/>
+        <w:tblBorders>
+          <w:top w:val="single" w:color="1A5FB4" w:sz="8"/>
+          <w:left w:val="single" w:color="1A5FB4" w:sz="8"/>
+          <w:bottom w:val="single" w:color="1A5FB4" w:sz="8"/>
+          <w:right w:val="single" w:color="1A5FB4" w:sz="8"/>
+          <w:insideH w:val="single" w:color="1A5FB4" w:sz="8"/>
+          <w:insideV w:val="single" w:color="1A5FB4" w:sz="8"/>
+        </w:tblBorders>
+      </w:tblPr>
+      <w:tblGrid>
+        <w:gridCol w:w="9360"/>
+      </w:tblGrid>
+      <w:tr>
+        <w:tc>
+          <w:tcPr>
+            <w:tcW w:type="dxa" w:w="9360"/>
+            <w:shd w:fill="F2F5F8" w:val="clear"/>
+            <w:tcMar>
+              <w:top w:type="dxa" w:w="110"/>
+              <w:left w:type="dxa" w:w="170"/>
+              <w:bottom w:type="dxa" w:w="110"/>
+              <w:right w:type="dxa" w:w="170"/>
+            </w:tcMar>
+          </w:tcPr>
+          <w:p>
+            <w:pPr>
+              <w:spacing w:after="0" w:line="280"/>
+            </w:pPr>
+            <w:r>
+              <w:rPr>
+                <w:b/>
+                <w:bCs/>
+                <w:color w:val="1A5FB4"/>
+                <w:sz w:val="15"/>
+                <w:szCs w:val="15"/>
+                <w:spacing w:val="20"/>
+              </w:rPr>
+              <w:t xml:space="preserve">WHEN   </w:t>
+            </w:r>
+            <w:r>
+              <w:rPr>
+                <w:b/>
+                <w:bCs/>
+                <w:color w:val="1B1B1B"/>
+                <w:sz w:val="20"/>
+                <w:szCs w:val="20"/>
+              </w:rPr>
+              <w:t xml:space="preserve">Somebody is annoyed that the camera does not work.</w:t>
+            </w:r>
+          </w:p>
+        </w:tc>
+      </w:tr>
+      <w:tr>
+        <w:tc>
+          <w:tcPr>
+            <w:tcW w:type="dxa" w:w="9360"/>
+            <w:tcMar>
+              <w:top w:type="dxa" w:w="170"/>
+              <w:left w:type="dxa" w:w="200"/>
+              <w:bottom w:type="dxa" w:w="150"/>
+              <w:right w:type="dxa" w:w="200"/>
+            </w:tcMar>
+          </w:tcPr>
+          <w:p>
+            <w:pPr>
+              <w:spacing w:after="130" w:line="320"/>
+            </w:pPr>
+            <w:r>
+              <w:rPr>
+                <w:color w:val="1B1B1B"/>
+                <w:sz w:val="23"/>
+                <w:szCs w:val="23"/>
+              </w:rPr>
+              <w:t xml:space="preserve">Good. You should be annoyed.</w:t>
+            </w:r>
+          </w:p>
+          <w:p>
+            <w:pPr>
+              <w:spacing w:after="130" w:line="320"/>
+            </w:pPr>
+            <w:r>
+              <w:rPr>
+                <w:color w:val="1B1B1B"/>
+                <w:sz w:val="23"/>
+                <w:szCs w:val="23"/>
+              </w:rPr>
+              <w:t xml:space="preserve">She filed a work order in July and nobody came out. That is the most realistic sentence in the whole file.</w:t>
+            </w:r>
+          </w:p>
+          <w:p>
+            <w:pPr>
+              <w:spacing w:after="130" w:line="320"/>
+            </w:pPr>
+            <w:r>
+              <w:rPr>
+                <w:color w:val="1B1B1B"/>
+                <w:sz w:val="23"/>
+                <w:szCs w:val="23"/>
+              </w:rPr>
+              <w:t xml:space="preserve">Half of investigation is finding out that the thing which would have answered your question was broken, or not switched on, or nobody kept it. You write that down too — that the camera was inoperative and when it was reported. That is a fact about the case.</w:t>
+            </w:r>
+          </w:p>
+        </w:tc>
+      </w:tr>
+    </w:tbl>
+    <w:p>
+      <w:pPr>
+        <w:spacing w:after="230" w:line="276"/>
+      </w:pPr>
+      <w:r>
+        <w:rPr>
+          <w:color w:val="1B1B1B"/>
+          <w:sz w:val="21"/>
+          <w:szCs w:val="21"/>
+        </w:rPr>
+        <w:t xml:space="preserve"/>
+      </w:r>
+    </w:p>
     <w:p>
       <w:r>
         <w:br w:type="page"/>

</xml_diff>